<commit_message>
Day 12: deepen Materi to the plan's Wissen (rule 2.17) with real findings
All 12 Wissen topics are now full: WHO disability and autism estimates, the Click-Away Pound survey,
the WebAIM Million 2025, the WCAG criteria for perception, keyboard, language and forms, the
European Accessibility Act and the Web Accessibility Directive. Day 12 added to verify:depth;
Word documents of Day 12 rebuilt.

Co-Authored-By: Claude Sonnet 5.5 <noreply@anthropic.com>
</commit_message>
<xml_diff>
--- a/docx/Day12-Materi-AION-UX-Developer-Accessibility-standards-and-neurodiversity.docx
+++ b/docx/Day12-Materi-AION-UX-Developer-Accessibility-standards-and-neurodiversity.docx
@@ -2777,6 +2777,319 @@
         <w:spacing w:before="0" w:after="80"/>
       </w:pPr>
     </w:p>
+    <w:p>
+      <w:pPr>
+        <w:spacing w:before="0" w:after="100"/>
+      </w:pPr>
+      <w:r>
+        <w:rPr>
+          <w:b/>
+        </w:rPr>
+        <w:t>Who is left out, and what it costs: real figures</w:t>
+      </w:r>
+    </w:p>
+    <w:tbl>
+      <w:tblPr>
+        <w:tblW w:w="9638" w:type="dxa"/>
+        <w:tblBorders>
+          <w:top w:val="single" w:sz="4" w:space="0" w:color="D5DEE9"/>
+          <w:left w:val="single" w:sz="4" w:space="0" w:color="D5DEE9"/>
+          <w:bottom w:val="single" w:sz="4" w:space="0" w:color="D5DEE9"/>
+          <w:right w:val="single" w:sz="4" w:space="0" w:color="D5DEE9"/>
+          <w:insideH w:val="single" w:sz="4" w:space="0" w:color="D5DEE9"/>
+          <w:insideV w:val="single" w:sz="4" w:space="0" w:color="D5DEE9"/>
+        </w:tblBorders>
+        <w:tblLayout w:type="fixed"/>
+        <w:tblCellMar>
+          <w:top w:w="60" w:type="dxa"/>
+          <w:left w:w="100" w:type="dxa"/>
+          <w:bottom w:w="60" w:type="dxa"/>
+          <w:right w:w="100" w:type="dxa"/>
+        </w:tblCellMar>
+      </w:tblPr>
+      <w:tblGrid>
+        <w:gridCol w:w="1857"/>
+        <w:gridCol w:w="4996"/>
+        <w:gridCol w:w="2785"/>
+      </w:tblGrid>
+      <w:tr>
+        <w:trPr>
+          <w:cantSplit/>
+          <w:tblHeader/>
+        </w:trPr>
+        <w:tc>
+          <w:tcPr>
+            <w:tcW w:type="dxa" w:w="1857"/>
+            <w:shd w:val="clear" w:color="auto" w:fill="E6ECF4"/>
+          </w:tcPr>
+          <w:p>
+            <w:pPr>
+              <w:spacing w:before="0" w:after="0"/>
+            </w:pPr>
+            <w:r>
+              <w:rPr>
+                <w:b/>
+                <w:sz w:val="20"/>
+              </w:rPr>
+              <w:t>Fact</w:t>
+            </w:r>
+          </w:p>
+        </w:tc>
+        <w:tc>
+          <w:tcPr>
+            <w:tcW w:type="dxa" w:w="4996"/>
+            <w:shd w:val="clear" w:color="auto" w:fill="E6ECF4"/>
+          </w:tcPr>
+          <w:p>
+            <w:pPr>
+              <w:spacing w:before="0" w:after="0"/>
+            </w:pPr>
+            <w:r>
+              <w:rPr>
+                <w:b/>
+                <w:sz w:val="20"/>
+              </w:rPr>
+              <w:t>Real finding</w:t>
+            </w:r>
+          </w:p>
+        </w:tc>
+        <w:tc>
+          <w:tcPr>
+            <w:tcW w:type="dxa" w:w="2785"/>
+            <w:shd w:val="clear" w:color="auto" w:fill="E6ECF4"/>
+          </w:tcPr>
+          <w:p>
+            <w:pPr>
+              <w:spacing w:before="0" w:after="0"/>
+            </w:pPr>
+            <w:r>
+              <w:rPr>
+                <w:b/>
+                <w:sz w:val="20"/>
+              </w:rPr>
+              <w:t>What it means for a screen</w:t>
+            </w:r>
+          </w:p>
+        </w:tc>
+      </w:tr>
+      <w:tr>
+        <w:trPr>
+          <w:cantSplit/>
+        </w:trPr>
+        <w:tc>
+          <w:tcPr>
+            <w:tcW w:type="dxa" w:w="1857"/>
+          </w:tcPr>
+          <w:p>
+            <w:pPr>
+              <w:spacing w:before="0" w:after="0"/>
+            </w:pPr>
+            <w:r>
+              <w:rPr>
+                <w:sz w:val="20"/>
+              </w:rPr>
+              <w:t>How many people</w:t>
+            </w:r>
+          </w:p>
+        </w:tc>
+        <w:tc>
+          <w:tcPr>
+            <w:tcW w:type="dxa" w:w="4996"/>
+          </w:tcPr>
+          <w:p>
+            <w:pPr>
+              <w:spacing w:before="0" w:after="0"/>
+            </w:pPr>
+            <w:r>
+              <w:rPr>
+                <w:sz w:val="20"/>
+              </w:rPr>
+              <w:t>About 1.3 billion people, roughly 16% of the world's population, live with a significant disability (World Health Organization 2022).</w:t>
+            </w:r>
+          </w:p>
+        </w:tc>
+        <w:tc>
+          <w:tcPr>
+            <w:tcW w:type="dxa" w:w="2785"/>
+          </w:tcPr>
+          <w:p>
+            <w:pPr>
+              <w:spacing w:before="0" w:after="0"/>
+            </w:pPr>
+            <w:r>
+              <w:rPr>
+                <w:sz w:val="20"/>
+              </w:rPr>
+              <w:t>Accessibility is not an edge case: about one in six people is affected permanently.</w:t>
+            </w:r>
+          </w:p>
+        </w:tc>
+      </w:tr>
+      <w:tr>
+        <w:trPr>
+          <w:cantSplit/>
+        </w:trPr>
+        <w:tc>
+          <w:tcPr>
+            <w:tcW w:type="dxa" w:w="1857"/>
+          </w:tcPr>
+          <w:p>
+            <w:pPr>
+              <w:spacing w:before="0" w:after="0"/>
+            </w:pPr>
+            <w:r>
+              <w:rPr>
+                <w:sz w:val="20"/>
+              </w:rPr>
+              <w:t>Permanent, temporary, situational</w:t>
+            </w:r>
+          </w:p>
+        </w:tc>
+        <w:tc>
+          <w:tcPr>
+            <w:tcW w:type="dxa" w:w="4996"/>
+          </w:tcPr>
+          <w:p>
+            <w:pPr>
+              <w:spacing w:before="0" w:after="0"/>
+            </w:pPr>
+            <w:r>
+              <w:rPr>
+                <w:sz w:val="20"/>
+              </w:rPr>
+              <w:t>Holmes describes disability as a mismatch between a person and a design, with permanent, temporary and situational forms: one arm, an injured arm, a baby on the arm (Holmes 2018).</w:t>
+            </w:r>
+          </w:p>
+        </w:tc>
+        <w:tc>
+          <w:tcPr>
+            <w:tcW w:type="dxa" w:w="2785"/>
+          </w:tcPr>
+          <w:p>
+            <w:pPr>
+              <w:spacing w:before="0" w:after="0"/>
+            </w:pPr>
+            <w:r>
+              <w:rPr>
+                <w:sz w:val="20"/>
+              </w:rPr>
+              <w:t>A repair for one group often helps many more.</w:t>
+            </w:r>
+          </w:p>
+        </w:tc>
+      </w:tr>
+      <w:tr>
+        <w:trPr>
+          <w:cantSplit/>
+        </w:trPr>
+        <w:tc>
+          <w:tcPr>
+            <w:tcW w:type="dxa" w:w="1857"/>
+          </w:tcPr>
+          <w:p>
+            <w:pPr>
+              <w:spacing w:before="0" w:after="0"/>
+            </w:pPr>
+            <w:r>
+              <w:rPr>
+                <w:sz w:val="20"/>
+              </w:rPr>
+              <w:t>Customers who leave</w:t>
+            </w:r>
+          </w:p>
+        </w:tc>
+        <w:tc>
+          <w:tcPr>
+            <w:tcW w:type="dxa" w:w="4996"/>
+          </w:tcPr>
+          <w:p>
+            <w:pPr>
+              <w:spacing w:before="0" w:after="0"/>
+            </w:pPr>
+            <w:r>
+              <w:rPr>
+                <w:sz w:val="20"/>
+              </w:rPr>
+              <w:t>In a UK survey of online shoppers with access needs, 69% said they would click away from a website that they found difficult to use because of their disability, and only 8% had told a site owner about the barriers they met (Click-Away Pound 2019, as reported).</w:t>
+            </w:r>
+          </w:p>
+        </w:tc>
+        <w:tc>
+          <w:tcPr>
+            <w:tcW w:type="dxa" w:w="2785"/>
+          </w:tcPr>
+          <w:p>
+            <w:pPr>
+              <w:spacing w:before="0" w:after="0"/>
+            </w:pPr>
+            <w:r>
+              <w:rPr>
+                <w:sz w:val="20"/>
+              </w:rPr>
+              <w:t>Most businesses do not hear about the barriers: a lost customer is silent.</w:t>
+            </w:r>
+          </w:p>
+        </w:tc>
+      </w:tr>
+      <w:tr>
+        <w:trPr>
+          <w:cantSplit/>
+        </w:trPr>
+        <w:tc>
+          <w:tcPr>
+            <w:tcW w:type="dxa" w:w="1857"/>
+          </w:tcPr>
+          <w:p>
+            <w:pPr>
+              <w:spacing w:before="0" w:after="0"/>
+            </w:pPr>
+            <w:r>
+              <w:rPr>
+                <w:sz w:val="20"/>
+              </w:rPr>
+              <w:t>Words that are mixed up</w:t>
+            </w:r>
+          </w:p>
+        </w:tc>
+        <w:tc>
+          <w:tcPr>
+            <w:tcW w:type="dxa" w:w="4996"/>
+          </w:tcPr>
+          <w:p>
+            <w:pPr>
+              <w:spacing w:before="0" w:after="0"/>
+            </w:pPr>
+            <w:r>
+              <w:rPr>
+                <w:sz w:val="20"/>
+              </w:rPr>
+              <w:t>Accessibility, access, usability and inclusive design answer four different questions (see the table above).</w:t>
+            </w:r>
+          </w:p>
+        </w:tc>
+        <w:tc>
+          <w:tcPr>
+            <w:tcW w:type="dxa" w:w="2785"/>
+          </w:tcPr>
+          <w:p>
+            <w:pPr>
+              <w:spacing w:before="0" w:after="0"/>
+            </w:pPr>
+            <w:r>
+              <w:rPr>
+                <w:sz w:val="20"/>
+              </w:rPr>
+              <w:t>Say which one a requirement is about.</w:t>
+            </w:r>
+          </w:p>
+        </w:tc>
+      </w:tr>
+    </w:tbl>
+    <w:p>
+      <w:pPr>
+        <w:spacing w:before="0" w:after="80"/>
+      </w:pPr>
+    </w:p>
     <w:tbl>
       <w:tblPr>
         <w:tblW w:w="9598" w:type="dxa"/>
@@ -2826,7 +3139,7 @@
             </w:pPr>
             <w:r>
               <w:rPr/>
-              <w:t>Greenway, Kofi, Liv, Arjun, Sanne and Henrik are made up for this example. Disability as a mismatch between person and design, and permanent, temporary and situational limits, follow Holmes (2018). Public bodies' duty to make websites and apps accessible follows the EU Web Accessibility Directive (2016).</w:t>
+              <w:t>Greenway, Kofi, Liv, Arjun, Sanne and Henrik are made up for this example. Disability as a mismatch between person and design, and permanent, temporary and situational limits, follow Holmes (2018). Public bodies' duty to make websites and apps accessible follows the EU Web Accessibility Directive (2016). The findings in the table of real evidence are real research results, rules and cases; the sources are listed below.</w:t>
             </w:r>
           </w:p>
         </w:tc>
@@ -3015,7 +3328,7 @@
           <w:color w:val="556274"/>
           <w:sz w:val="18"/>
         </w:rPr>
-        <w:t>Holmes 2018 · EU 2016 (Web Accessibility Directive)</w:t>
+        <w:t>Holmes 2018 · EU 2016 (Web Accessibility Directive) · WHO 2022 · Click-Away Pound 2019</w:t>
       </w:r>
     </w:p>
     <w:p>
@@ -3250,6 +3563,319 @@
         <w:t>Figure 3 · Greenway product tiles with or without words for “out of stock” and text alternatives for the images. Shown here in its starting state; in the Neuro-UX Lab every version and every stress test can be used.</w:t>
       </w:r>
     </w:p>
+    <w:p>
+      <w:pPr>
+        <w:spacing w:before="0" w:after="100"/>
+      </w:pPr>
+      <w:r>
+        <w:rPr>
+          <w:b/>
+        </w:rPr>
+        <w:t>Barriers in perception: how common they are, and the rules</w:t>
+      </w:r>
+    </w:p>
+    <w:tbl>
+      <w:tblPr>
+        <w:tblW w:w="9638" w:type="dxa"/>
+        <w:tblBorders>
+          <w:top w:val="single" w:sz="4" w:space="0" w:color="D5DEE9"/>
+          <w:left w:val="single" w:sz="4" w:space="0" w:color="D5DEE9"/>
+          <w:bottom w:val="single" w:sz="4" w:space="0" w:color="D5DEE9"/>
+          <w:right w:val="single" w:sz="4" w:space="0" w:color="D5DEE9"/>
+          <w:insideH w:val="single" w:sz="4" w:space="0" w:color="D5DEE9"/>
+          <w:insideV w:val="single" w:sz="4" w:space="0" w:color="D5DEE9"/>
+        </w:tblBorders>
+        <w:tblLayout w:type="fixed"/>
+        <w:tblCellMar>
+          <w:top w:w="60" w:type="dxa"/>
+          <w:left w:w="100" w:type="dxa"/>
+          <w:bottom w:w="60" w:type="dxa"/>
+          <w:right w:w="100" w:type="dxa"/>
+        </w:tblCellMar>
+      </w:tblPr>
+      <w:tblGrid>
+        <w:gridCol w:w="1884"/>
+        <w:gridCol w:w="5018"/>
+        <w:gridCol w:w="2736"/>
+      </w:tblGrid>
+      <w:tr>
+        <w:trPr>
+          <w:cantSplit/>
+          <w:tblHeader/>
+        </w:trPr>
+        <w:tc>
+          <w:tcPr>
+            <w:tcW w:type="dxa" w:w="1884"/>
+            <w:shd w:val="clear" w:color="auto" w:fill="E6ECF4"/>
+          </w:tcPr>
+          <w:p>
+            <w:pPr>
+              <w:spacing w:before="0" w:after="0"/>
+            </w:pPr>
+            <w:r>
+              <w:rPr>
+                <w:b/>
+                <w:sz w:val="20"/>
+              </w:rPr>
+              <w:t>Topic</w:t>
+            </w:r>
+          </w:p>
+        </w:tc>
+        <w:tc>
+          <w:tcPr>
+            <w:tcW w:type="dxa" w:w="5018"/>
+            <w:shd w:val="clear" w:color="auto" w:fill="E6ECF4"/>
+          </w:tcPr>
+          <w:p>
+            <w:pPr>
+              <w:spacing w:before="0" w:after="0"/>
+            </w:pPr>
+            <w:r>
+              <w:rPr>
+                <w:b/>
+                <w:sz w:val="20"/>
+              </w:rPr>
+              <w:t>Real finding or rule</w:t>
+            </w:r>
+          </w:p>
+        </w:tc>
+        <w:tc>
+          <w:tcPr>
+            <w:tcW w:type="dxa" w:w="2736"/>
+            <w:shd w:val="clear" w:color="auto" w:fill="E6ECF4"/>
+          </w:tcPr>
+          <w:p>
+            <w:pPr>
+              <w:spacing w:before="0" w:after="0"/>
+            </w:pPr>
+            <w:r>
+              <w:rPr>
+                <w:b/>
+                <w:sz w:val="20"/>
+              </w:rPr>
+              <w:t>What it means for a screen</w:t>
+            </w:r>
+          </w:p>
+        </w:tc>
+      </w:tr>
+      <w:tr>
+        <w:trPr>
+          <w:cantSplit/>
+        </w:trPr>
+        <w:tc>
+          <w:tcPr>
+            <w:tcW w:type="dxa" w:w="1884"/>
+          </w:tcPr>
+          <w:p>
+            <w:pPr>
+              <w:spacing w:before="0" w:after="0"/>
+            </w:pPr>
+            <w:r>
+              <w:rPr>
+                <w:sz w:val="20"/>
+              </w:rPr>
+              <w:t>State of the web</w:t>
+            </w:r>
+          </w:p>
+        </w:tc>
+        <w:tc>
+          <w:tcPr>
+            <w:tcW w:type="dxa" w:w="5018"/>
+          </w:tcPr>
+          <w:p>
+            <w:pPr>
+              <w:spacing w:before="0" w:after="0"/>
+            </w:pPr>
+            <w:r>
+              <w:rPr>
+                <w:sz w:val="20"/>
+              </w:rPr>
+              <w:t>In the 2025 WebAIM Million analysis of home pages, 94.8% had detectable WCAG 2 failures; low-contrast text was found on about 79% of the pages and was the most common failure (WebAIM 2025, as reported).</w:t>
+            </w:r>
+          </w:p>
+        </w:tc>
+        <w:tc>
+          <w:tcPr>
+            <w:tcW w:type="dxa" w:w="2736"/>
+          </w:tcPr>
+          <w:p>
+            <w:pPr>
+              <w:spacing w:before="0" w:after="0"/>
+            </w:pPr>
+            <w:r>
+              <w:rPr>
+                <w:sz w:val="20"/>
+              </w:rPr>
+              <w:t>Contrast is the cheapest barrier to find and one of the cheapest to fix.</w:t>
+            </w:r>
+          </w:p>
+        </w:tc>
+      </w:tr>
+      <w:tr>
+        <w:trPr>
+          <w:cantSplit/>
+        </w:trPr>
+        <w:tc>
+          <w:tcPr>
+            <w:tcW w:type="dxa" w:w="1884"/>
+          </w:tcPr>
+          <w:p>
+            <w:pPr>
+              <w:spacing w:before="0" w:after="0"/>
+            </w:pPr>
+            <w:r>
+              <w:rPr>
+                <w:sz w:val="20"/>
+              </w:rPr>
+              <w:t>Contrast rules</w:t>
+            </w:r>
+          </w:p>
+        </w:tc>
+        <w:tc>
+          <w:tcPr>
+            <w:tcW w:type="dxa" w:w="5018"/>
+          </w:tcPr>
+          <w:p>
+            <w:pPr>
+              <w:spacing w:before="0" w:after="0"/>
+            </w:pPr>
+            <w:r>
+              <w:rPr>
+                <w:sz w:val="20"/>
+              </w:rPr>
+              <w:t>WCAG 2.2 asks for at least 4.5 to 1 for normal text and 3 to 1 for large text and for controls (success criteria 1.4.3 and 1.4.11).</w:t>
+            </w:r>
+          </w:p>
+        </w:tc>
+        <w:tc>
+          <w:tcPr>
+            <w:tcW w:type="dxa" w:w="2736"/>
+          </w:tcPr>
+          <w:p>
+            <w:pPr>
+              <w:spacing w:before="0" w:after="0"/>
+            </w:pPr>
+            <w:r>
+              <w:rPr>
+                <w:sz w:val="20"/>
+              </w:rPr>
+              <w:t>Measure the ratio; do not judge by eye.</w:t>
+            </w:r>
+          </w:p>
+        </w:tc>
+      </w:tr>
+      <w:tr>
+        <w:trPr>
+          <w:cantSplit/>
+        </w:trPr>
+        <w:tc>
+          <w:tcPr>
+            <w:tcW w:type="dxa" w:w="1884"/>
+          </w:tcPr>
+          <w:p>
+            <w:pPr>
+              <w:spacing w:before="0" w:after="0"/>
+            </w:pPr>
+            <w:r>
+              <w:rPr>
+                <w:sz w:val="20"/>
+              </w:rPr>
+              <w:t>Text alternatives</w:t>
+            </w:r>
+          </w:p>
+        </w:tc>
+        <w:tc>
+          <w:tcPr>
+            <w:tcW w:type="dxa" w:w="5018"/>
+          </w:tcPr>
+          <w:p>
+            <w:pPr>
+              <w:spacing w:before="0" w:after="0"/>
+            </w:pPr>
+            <w:r>
+              <w:rPr>
+                <w:sz w:val="20"/>
+              </w:rPr>
+              <w:t>Non-text content needs a text alternative that serves the same purpose (WCAG 1.1.1); decorative images get an empty alternative.</w:t>
+            </w:r>
+          </w:p>
+        </w:tc>
+        <w:tc>
+          <w:tcPr>
+            <w:tcW w:type="dxa" w:w="2736"/>
+          </w:tcPr>
+          <w:p>
+            <w:pPr>
+              <w:spacing w:before="0" w:after="0"/>
+            </w:pPr>
+            <w:r>
+              <w:rPr>
+                <w:sz w:val="20"/>
+              </w:rPr>
+              <w:t>Write the alternative for what the image does here, not for what it shows.</w:t>
+            </w:r>
+          </w:p>
+        </w:tc>
+      </w:tr>
+      <w:tr>
+        <w:trPr>
+          <w:cantSplit/>
+        </w:trPr>
+        <w:tc>
+          <w:tcPr>
+            <w:tcW w:type="dxa" w:w="1884"/>
+          </w:tcPr>
+          <w:p>
+            <w:pPr>
+              <w:spacing w:before="0" w:after="0"/>
+            </w:pPr>
+            <w:r>
+              <w:rPr>
+                <w:sz w:val="20"/>
+              </w:rPr>
+              <w:t>Colour alone</w:t>
+            </w:r>
+          </w:p>
+        </w:tc>
+        <w:tc>
+          <w:tcPr>
+            <w:tcW w:type="dxa" w:w="5018"/>
+          </w:tcPr>
+          <w:p>
+            <w:pPr>
+              <w:spacing w:before="0" w:after="0"/>
+            </w:pPr>
+            <w:r>
+              <w:rPr>
+                <w:sz w:val="20"/>
+              </w:rPr>
+              <w:t>Colour must not be the only way to give information (WCAG 1.4.1); about 1 in 12 men have a colour vision deficiency (Wong 2011).</w:t>
+            </w:r>
+          </w:p>
+        </w:tc>
+        <w:tc>
+          <w:tcPr>
+            <w:tcW w:type="dxa" w:w="2736"/>
+          </w:tcPr>
+          <w:p>
+            <w:pPr>
+              <w:spacing w:before="0" w:after="0"/>
+            </w:pPr>
+            <w:r>
+              <w:rPr>
+                <w:sz w:val="20"/>
+              </w:rPr>
+              <w:t>Add words or shapes to colour codes.</w:t>
+            </w:r>
+          </w:p>
+        </w:tc>
+      </w:tr>
+    </w:tbl>
+    <w:p>
+      <w:pPr>
+        <w:spacing w:before="0" w:after="80"/>
+      </w:pPr>
+    </w:p>
     <w:tbl>
       <w:tblPr>
         <w:tblW w:w="9598" w:type="dxa"/>
@@ -3299,7 +3925,7 @@
             </w:pPr>
             <w:r>
               <w:rPr/>
-              <w:t>Greenway, Kofi, Liv, Arjun, Sanne and Henrik are made up for this example. The contrast ratios and the rule against colour alone follow WCAG 2.2; the ratio in the picture is computed with the standard's formula.</w:t>
+              <w:t>Greenway, Kofi, Liv, Arjun, Sanne and Henrik are made up for this example. The contrast ratios and the rule against colour alone follow WCAG 2.2; the ratio in the picture is computed with the standard's formula. The findings in the table of real evidence are real research results, rules and cases; the sources are listed below.</w:t>
             </w:r>
           </w:p>
         </w:tc>
@@ -3488,7 +4114,7 @@
           <w:color w:val="556274"/>
           <w:sz w:val="18"/>
         </w:rPr>
-        <w:t>WCAG 2.2 · Holmes 2018</w:t>
+        <w:t>WCAG 2.2 · Holmes 2018 · WebAIM 2025 · Wong 2011</w:t>
       </w:r>
     </w:p>
     <w:p>
@@ -4034,6 +4660,319 @@
         <w:spacing w:before="0" w:after="80"/>
       </w:pPr>
     </w:p>
+    <w:p>
+      <w:pPr>
+        <w:spacing w:before="0" w:after="100"/>
+      </w:pPr>
+      <w:r>
+        <w:rPr>
+          <w:b/>
+        </w:rPr>
+        <w:t>Barriers in interaction: the rules behind the keyboard test</w:t>
+      </w:r>
+    </w:p>
+    <w:tbl>
+      <w:tblPr>
+        <w:tblW w:w="9638" w:type="dxa"/>
+        <w:tblBorders>
+          <w:top w:val="single" w:sz="4" w:space="0" w:color="D5DEE9"/>
+          <w:left w:val="single" w:sz="4" w:space="0" w:color="D5DEE9"/>
+          <w:bottom w:val="single" w:sz="4" w:space="0" w:color="D5DEE9"/>
+          <w:right w:val="single" w:sz="4" w:space="0" w:color="D5DEE9"/>
+          <w:insideH w:val="single" w:sz="4" w:space="0" w:color="D5DEE9"/>
+          <w:insideV w:val="single" w:sz="4" w:space="0" w:color="D5DEE9"/>
+        </w:tblBorders>
+        <w:tblLayout w:type="fixed"/>
+        <w:tblCellMar>
+          <w:top w:w="60" w:type="dxa"/>
+          <w:left w:w="100" w:type="dxa"/>
+          <w:bottom w:w="60" w:type="dxa"/>
+          <w:right w:w="100" w:type="dxa"/>
+        </w:tblCellMar>
+      </w:tblPr>
+      <w:tblGrid>
+        <w:gridCol w:w="1877"/>
+        <w:gridCol w:w="4412"/>
+        <w:gridCol w:w="3349"/>
+      </w:tblGrid>
+      <w:tr>
+        <w:trPr>
+          <w:cantSplit/>
+          <w:tblHeader/>
+        </w:trPr>
+        <w:tc>
+          <w:tcPr>
+            <w:tcW w:type="dxa" w:w="1877"/>
+            <w:shd w:val="clear" w:color="auto" w:fill="E6ECF4"/>
+          </w:tcPr>
+          <w:p>
+            <w:pPr>
+              <w:spacing w:before="0" w:after="0"/>
+            </w:pPr>
+            <w:r>
+              <w:rPr>
+                <w:b/>
+                <w:sz w:val="20"/>
+              </w:rPr>
+              <w:t>Check</w:t>
+            </w:r>
+          </w:p>
+        </w:tc>
+        <w:tc>
+          <w:tcPr>
+            <w:tcW w:type="dxa" w:w="4412"/>
+            <w:shd w:val="clear" w:color="auto" w:fill="E6ECF4"/>
+          </w:tcPr>
+          <w:p>
+            <w:pPr>
+              <w:spacing w:before="0" w:after="0"/>
+            </w:pPr>
+            <w:r>
+              <w:rPr>
+                <w:b/>
+                <w:sz w:val="20"/>
+              </w:rPr>
+              <w:t>Real rule</w:t>
+            </w:r>
+          </w:p>
+        </w:tc>
+        <w:tc>
+          <w:tcPr>
+            <w:tcW w:type="dxa" w:w="3349"/>
+            <w:shd w:val="clear" w:color="auto" w:fill="E6ECF4"/>
+          </w:tcPr>
+          <w:p>
+            <w:pPr>
+              <w:spacing w:before="0" w:after="0"/>
+            </w:pPr>
+            <w:r>
+              <w:rPr>
+                <w:b/>
+                <w:sz w:val="20"/>
+              </w:rPr>
+              <w:t>What it means for a screen</w:t>
+            </w:r>
+          </w:p>
+        </w:tc>
+      </w:tr>
+      <w:tr>
+        <w:trPr>
+          <w:cantSplit/>
+        </w:trPr>
+        <w:tc>
+          <w:tcPr>
+            <w:tcW w:type="dxa" w:w="1877"/>
+          </w:tcPr>
+          <w:p>
+            <w:pPr>
+              <w:spacing w:before="0" w:after="0"/>
+            </w:pPr>
+            <w:r>
+              <w:rPr>
+                <w:sz w:val="20"/>
+              </w:rPr>
+              <w:t>Everything by keyboard</w:t>
+            </w:r>
+          </w:p>
+        </w:tc>
+        <w:tc>
+          <w:tcPr>
+            <w:tcW w:type="dxa" w:w="4412"/>
+          </w:tcPr>
+          <w:p>
+            <w:pPr>
+              <w:spacing w:before="0" w:after="0"/>
+            </w:pPr>
+            <w:r>
+              <w:rPr>
+                <w:sz w:val="20"/>
+              </w:rPr>
+              <w:t>All functionality must be operable through a keyboard interface (WCAG 2.1.1).</w:t>
+            </w:r>
+          </w:p>
+        </w:tc>
+        <w:tc>
+          <w:tcPr>
+            <w:tcW w:type="dxa" w:w="3349"/>
+          </w:tcPr>
+          <w:p>
+            <w:pPr>
+              <w:spacing w:before="0" w:after="0"/>
+            </w:pPr>
+            <w:r>
+              <w:rPr>
+                <w:sz w:val="20"/>
+              </w:rPr>
+              <w:t>If it only works on hover or by mouse, it does not exist for a keyboard user.</w:t>
+            </w:r>
+          </w:p>
+        </w:tc>
+      </w:tr>
+      <w:tr>
+        <w:trPr>
+          <w:cantSplit/>
+        </w:trPr>
+        <w:tc>
+          <w:tcPr>
+            <w:tcW w:type="dxa" w:w="1877"/>
+          </w:tcPr>
+          <w:p>
+            <w:pPr>
+              <w:spacing w:before="0" w:after="0"/>
+            </w:pPr>
+            <w:r>
+              <w:rPr>
+                <w:sz w:val="20"/>
+              </w:rPr>
+              <w:t>No trap</w:t>
+            </w:r>
+          </w:p>
+        </w:tc>
+        <w:tc>
+          <w:tcPr>
+            <w:tcW w:type="dxa" w:w="4412"/>
+          </w:tcPr>
+          <w:p>
+            <w:pPr>
+              <w:spacing w:before="0" w:after="0"/>
+            </w:pPr>
+            <w:r>
+              <w:rPr>
+                <w:sz w:val="20"/>
+              </w:rPr>
+              <w:t>Keyboard focus must not be trapped in a part of the page (WCAG 2.1.2).</w:t>
+            </w:r>
+          </w:p>
+        </w:tc>
+        <w:tc>
+          <w:tcPr>
+            <w:tcW w:type="dxa" w:w="3349"/>
+          </w:tcPr>
+          <w:p>
+            <w:pPr>
+              <w:spacing w:before="0" w:after="0"/>
+            </w:pPr>
+            <w:r>
+              <w:rPr>
+                <w:sz w:val="20"/>
+              </w:rPr>
+              <w:t>Test that Tab and Shift+Tab can leave every dialog.</w:t>
+            </w:r>
+          </w:p>
+        </w:tc>
+      </w:tr>
+      <w:tr>
+        <w:trPr>
+          <w:cantSplit/>
+        </w:trPr>
+        <w:tc>
+          <w:tcPr>
+            <w:tcW w:type="dxa" w:w="1877"/>
+          </w:tcPr>
+          <w:p>
+            <w:pPr>
+              <w:spacing w:before="0" w:after="0"/>
+            </w:pPr>
+            <w:r>
+              <w:rPr>
+                <w:sz w:val="20"/>
+              </w:rPr>
+              <w:t>Focus order and visibility</w:t>
+            </w:r>
+          </w:p>
+        </w:tc>
+        <w:tc>
+          <w:tcPr>
+            <w:tcW w:type="dxa" w:w="4412"/>
+          </w:tcPr>
+          <w:p>
+            <w:pPr>
+              <w:spacing w:before="0" w:after="0"/>
+            </w:pPr>
+            <w:r>
+              <w:rPr>
+                <w:sz w:val="20"/>
+              </w:rPr>
+              <w:t>The focus order must preserve meaning, and the keyboard focus must be visible (WCAG 2.4.3 and 2.4.7).</w:t>
+            </w:r>
+          </w:p>
+        </w:tc>
+        <w:tc>
+          <w:tcPr>
+            <w:tcW w:type="dxa" w:w="3349"/>
+          </w:tcPr>
+          <w:p>
+            <w:pPr>
+              <w:spacing w:before="0" w:after="0"/>
+            </w:pPr>
+            <w:r>
+              <w:rPr>
+                <w:sz w:val="20"/>
+              </w:rPr>
+              <w:t>Follow the focus with your eyes: it should read like the page.</w:t>
+            </w:r>
+          </w:p>
+        </w:tc>
+      </w:tr>
+      <w:tr>
+        <w:trPr>
+          <w:cantSplit/>
+        </w:trPr>
+        <w:tc>
+          <w:tcPr>
+            <w:tcW w:type="dxa" w:w="1877"/>
+          </w:tcPr>
+          <w:p>
+            <w:pPr>
+              <w:spacing w:before="0" w:after="0"/>
+            </w:pPr>
+            <w:r>
+              <w:rPr>
+                <w:sz w:val="20"/>
+              </w:rPr>
+              <w:t>Target size</w:t>
+            </w:r>
+          </w:p>
+        </w:tc>
+        <w:tc>
+          <w:tcPr>
+            <w:tcW w:type="dxa" w:w="4412"/>
+          </w:tcPr>
+          <w:p>
+            <w:pPr>
+              <w:spacing w:before="0" w:after="0"/>
+            </w:pPr>
+            <w:r>
+              <w:rPr>
+                <w:sz w:val="20"/>
+              </w:rPr>
+              <w:t>Pointer targets should be at least 24 by 24 CSS pixels at level AA (WCAG 2.5.8).</w:t>
+            </w:r>
+          </w:p>
+        </w:tc>
+        <w:tc>
+          <w:tcPr>
+            <w:tcW w:type="dxa" w:w="3349"/>
+          </w:tcPr>
+          <w:p>
+            <w:pPr>
+              <w:spacing w:before="0" w:after="0"/>
+            </w:pPr>
+            <w:r>
+              <w:rPr>
+                <w:sz w:val="20"/>
+              </w:rPr>
+              <w:t>Small, crowded targets are a barrier for tremor and for thumbs.</w:t>
+            </w:r>
+          </w:p>
+        </w:tc>
+      </w:tr>
+    </w:tbl>
+    <w:p>
+      <w:pPr>
+        <w:spacing w:before="0" w:after="80"/>
+      </w:pPr>
+    </w:p>
     <w:tbl>
       <w:tblPr>
         <w:tblW w:w="9598" w:type="dxa"/>
@@ -4083,7 +5022,7 @@
             </w:pPr>
             <w:r>
               <w:rPr/>
-              <w:t>Greenway, Kofi, Liv, Arjun, Sanne and Henrik are made up for this example. Keyboard operability, focus order and visible focus follow WCAG 2.2.</w:t>
+              <w:t>Greenway, Kofi, Liv, Arjun, Sanne and Henrik are made up for this example. Keyboard operability, focus order and visible focus follow WCAG 2.2. The findings in the table of real evidence are real research results, rules and cases; the sources are listed below.</w:t>
             </w:r>
           </w:p>
         </w:tc>
@@ -4767,6 +5706,319 @@
         <w:spacing w:before="0" w:after="80"/>
       </w:pPr>
     </w:p>
+    <w:p>
+      <w:pPr>
+        <w:spacing w:before="0" w:after="100"/>
+      </w:pPr>
+      <w:r>
+        <w:rPr>
+          <w:b/>
+        </w:rPr>
+        <w:t>Language, structure and neurodiversity: findings</w:t>
+      </w:r>
+    </w:p>
+    <w:tbl>
+      <w:tblPr>
+        <w:tblW w:w="9638" w:type="dxa"/>
+        <w:tblBorders>
+          <w:top w:val="single" w:sz="4" w:space="0" w:color="D5DEE9"/>
+          <w:left w:val="single" w:sz="4" w:space="0" w:color="D5DEE9"/>
+          <w:bottom w:val="single" w:sz="4" w:space="0" w:color="D5DEE9"/>
+          <w:right w:val="single" w:sz="4" w:space="0" w:color="D5DEE9"/>
+          <w:insideH w:val="single" w:sz="4" w:space="0" w:color="D5DEE9"/>
+          <w:insideV w:val="single" w:sz="4" w:space="0" w:color="D5DEE9"/>
+        </w:tblBorders>
+        <w:tblLayout w:type="fixed"/>
+        <w:tblCellMar>
+          <w:top w:w="60" w:type="dxa"/>
+          <w:left w:w="100" w:type="dxa"/>
+          <w:bottom w:w="60" w:type="dxa"/>
+          <w:right w:w="100" w:type="dxa"/>
+        </w:tblCellMar>
+      </w:tblPr>
+      <w:tblGrid>
+        <w:gridCol w:w="1427"/>
+        <w:gridCol w:w="4644"/>
+        <w:gridCol w:w="3567"/>
+      </w:tblGrid>
+      <w:tr>
+        <w:trPr>
+          <w:cantSplit/>
+          <w:tblHeader/>
+        </w:trPr>
+        <w:tc>
+          <w:tcPr>
+            <w:tcW w:type="dxa" w:w="1427"/>
+            <w:shd w:val="clear" w:color="auto" w:fill="E6ECF4"/>
+          </w:tcPr>
+          <w:p>
+            <w:pPr>
+              <w:spacing w:before="0" w:after="0"/>
+            </w:pPr>
+            <w:r>
+              <w:rPr>
+                <w:b/>
+                <w:sz w:val="20"/>
+              </w:rPr>
+              <w:t>Topic</w:t>
+            </w:r>
+          </w:p>
+        </w:tc>
+        <w:tc>
+          <w:tcPr>
+            <w:tcW w:type="dxa" w:w="4644"/>
+            <w:shd w:val="clear" w:color="auto" w:fill="E6ECF4"/>
+          </w:tcPr>
+          <w:p>
+            <w:pPr>
+              <w:spacing w:before="0" w:after="0"/>
+            </w:pPr>
+            <w:r>
+              <w:rPr>
+                <w:b/>
+                <w:sz w:val="20"/>
+              </w:rPr>
+              <w:t>Real finding or rule</w:t>
+            </w:r>
+          </w:p>
+        </w:tc>
+        <w:tc>
+          <w:tcPr>
+            <w:tcW w:type="dxa" w:w="3567"/>
+            <w:shd w:val="clear" w:color="auto" w:fill="E6ECF4"/>
+          </w:tcPr>
+          <w:p>
+            <w:pPr>
+              <w:spacing w:before="0" w:after="0"/>
+            </w:pPr>
+            <w:r>
+              <w:rPr>
+                <w:b/>
+                <w:sz w:val="20"/>
+              </w:rPr>
+              <w:t>What it means for a screen</w:t>
+            </w:r>
+          </w:p>
+        </w:tc>
+      </w:tr>
+      <w:tr>
+        <w:trPr>
+          <w:cantSplit/>
+        </w:trPr>
+        <w:tc>
+          <w:tcPr>
+            <w:tcW w:type="dxa" w:w="1427"/>
+          </w:tcPr>
+          <w:p>
+            <w:pPr>
+              <w:spacing w:before="0" w:after="0"/>
+            </w:pPr>
+            <w:r>
+              <w:rPr>
+                <w:sz w:val="20"/>
+              </w:rPr>
+              <w:t>Autism</w:t>
+            </w:r>
+          </w:p>
+        </w:tc>
+        <w:tc>
+          <w:tcPr>
+            <w:tcW w:type="dxa" w:w="4644"/>
+          </w:tcPr>
+          <w:p>
+            <w:pPr>
+              <w:spacing w:before="0" w:after="0"/>
+            </w:pPr>
+            <w:r>
+              <w:rPr>
+                <w:sz w:val="20"/>
+              </w:rPr>
+              <w:t>The World Health Organization estimates that about one in 100 children has autism, with large differences between studies (World Health Organization 2022).</w:t>
+            </w:r>
+          </w:p>
+        </w:tc>
+        <w:tc>
+          <w:tcPr>
+            <w:tcW w:type="dxa" w:w="3567"/>
+          </w:tcPr>
+          <w:p>
+            <w:pPr>
+              <w:spacing w:before="0" w:after="0"/>
+            </w:pPr>
+            <w:r>
+              <w:rPr>
+                <w:sz w:val="20"/>
+              </w:rPr>
+              <w:t>Literal, predictable wording and consistent pages help a group that is not small.</w:t>
+            </w:r>
+          </w:p>
+        </w:tc>
+      </w:tr>
+      <w:tr>
+        <w:trPr>
+          <w:cantSplit/>
+        </w:trPr>
+        <w:tc>
+          <w:tcPr>
+            <w:tcW w:type="dxa" w:w="1427"/>
+          </w:tcPr>
+          <w:p>
+            <w:pPr>
+              <w:spacing w:before="0" w:after="0"/>
+            </w:pPr>
+            <w:r>
+              <w:rPr>
+                <w:sz w:val="20"/>
+              </w:rPr>
+              <w:t>Dyslexia</w:t>
+            </w:r>
+          </w:p>
+        </w:tc>
+        <w:tc>
+          <w:tcPr>
+            <w:tcW w:type="dxa" w:w="4644"/>
+          </w:tcPr>
+          <w:p>
+            <w:pPr>
+              <w:spacing w:before="0" w:after="0"/>
+            </w:pPr>
+            <w:r>
+              <w:rPr>
+                <w:sz w:val="20"/>
+              </w:rPr>
+              <w:t>How many people have dyslexia depends on the definition: it is better described as a continuum than as one figure, and the often-quoted 10% has no traceable source (Dyslexia Action).</w:t>
+            </w:r>
+          </w:p>
+        </w:tc>
+        <w:tc>
+          <w:tcPr>
+            <w:tcW w:type="dxa" w:w="3567"/>
+          </w:tcPr>
+          <w:p>
+            <w:pPr>
+              <w:spacing w:before="0" w:after="0"/>
+            </w:pPr>
+            <w:r>
+              <w:rPr>
+                <w:sz w:val="20"/>
+              </w:rPr>
+              <w:t>Use the dyslexia style guide as a design rule: plain words, short sentences, left-aligned text, good spacing (British Dyslexia Association 2023).</w:t>
+            </w:r>
+          </w:p>
+        </w:tc>
+      </w:tr>
+      <w:tr>
+        <w:trPr>
+          <w:cantSplit/>
+        </w:trPr>
+        <w:tc>
+          <w:tcPr>
+            <w:tcW w:type="dxa" w:w="1427"/>
+          </w:tcPr>
+          <w:p>
+            <w:pPr>
+              <w:spacing w:before="0" w:after="0"/>
+            </w:pPr>
+            <w:r>
+              <w:rPr>
+                <w:sz w:val="20"/>
+              </w:rPr>
+              <w:t>Forms and errors</w:t>
+            </w:r>
+          </w:p>
+        </w:tc>
+        <w:tc>
+          <w:tcPr>
+            <w:tcW w:type="dxa" w:w="4644"/>
+          </w:tcPr>
+          <w:p>
+            <w:pPr>
+              <w:spacing w:before="0" w:after="0"/>
+            </w:pPr>
+            <w:r>
+              <w:rPr>
+                <w:sz w:val="20"/>
+              </w:rPr>
+              <w:t>Errors must be identified and described in text (WCAG 3.3.1), and WCAG 2.2 adds that a login must not rely on remembering or transcribing a code (3.3.8).</w:t>
+            </w:r>
+          </w:p>
+        </w:tc>
+        <w:tc>
+          <w:tcPr>
+            <w:tcW w:type="dxa" w:w="3567"/>
+          </w:tcPr>
+          <w:p>
+            <w:pPr>
+              <w:spacing w:before="0" w:after="0"/>
+            </w:pPr>
+            <w:r>
+              <w:rPr>
+                <w:sz w:val="20"/>
+              </w:rPr>
+              <w:t>Say what went wrong and how to fix it; do not make people recall or retype.</w:t>
+            </w:r>
+          </w:p>
+        </w:tc>
+      </w:tr>
+      <w:tr>
+        <w:trPr>
+          <w:cantSplit/>
+        </w:trPr>
+        <w:tc>
+          <w:tcPr>
+            <w:tcW w:type="dxa" w:w="1427"/>
+          </w:tcPr>
+          <w:p>
+            <w:pPr>
+              <w:spacing w:before="0" w:after="0"/>
+            </w:pPr>
+            <w:r>
+              <w:rPr>
+                <w:sz w:val="20"/>
+              </w:rPr>
+              <w:t>Structure</w:t>
+            </w:r>
+          </w:p>
+        </w:tc>
+        <w:tc>
+          <w:tcPr>
+            <w:tcW w:type="dxa" w:w="4644"/>
+          </w:tcPr>
+          <w:p>
+            <w:pPr>
+              <w:spacing w:before="0" w:after="0"/>
+            </w:pPr>
+            <w:r>
+              <w:rPr>
+                <w:sz w:val="20"/>
+              </w:rPr>
+              <w:t>Headings and labels must describe the topic or the purpose (WCAG 2.4.6).</w:t>
+            </w:r>
+          </w:p>
+        </w:tc>
+        <w:tc>
+          <w:tcPr>
+            <w:tcW w:type="dxa" w:w="3567"/>
+          </w:tcPr>
+          <w:p>
+            <w:pPr>
+              <w:spacing w:before="0" w:after="0"/>
+            </w:pPr>
+            <w:r>
+              <w:rPr>
+                <w:sz w:val="20"/>
+              </w:rPr>
+              <w:t>Clear structure helps every reader and every assistive technology.</w:t>
+            </w:r>
+          </w:p>
+        </w:tc>
+      </w:tr>
+    </w:tbl>
+    <w:p>
+      <w:pPr>
+        <w:spacing w:before="0" w:after="80"/>
+      </w:pPr>
+    </w:p>
     <w:tbl>
       <w:tblPr>
         <w:tblW w:w="9598" w:type="dxa"/>
@@ -4816,7 +6068,7 @@
             </w:pPr>
             <w:r>
               <w:rPr/>
-              <w:t>Greenway, Kofi, Liv, Arjun, Sanne and Henrik are made up for this example. The reading advice follows the British Dyslexia Association's style guide (2023); labels, instructions and error suggestions follow WCAG 2.2. Day 13 goes deeper into neurodiversity.</w:t>
+              <w:t>Greenway, Kofi, Liv, Arjun, Sanne and Henrik are made up for this example. The reading advice follows the British Dyslexia Association's style guide (2023); labels, instructions and error suggestions follow WCAG 2.2. Day 13 goes deeper into neurodiversity. The findings in the table of real evidence are real research results, rules and cases; the sources are listed below.</w:t>
             </w:r>
           </w:p>
         </w:tc>
@@ -5005,7 +6257,7 @@
           <w:color w:val="556274"/>
           <w:sz w:val="18"/>
         </w:rPr>
-        <w:t>British Dyslexia Association 2023 · WCAG 2.2</w:t>
+        <w:t>British Dyslexia Association 2023 · WCAG 2.2 · WHO autism fact sheet · Dyslexia Action</w:t>
       </w:r>
     </w:p>
     <w:p>
@@ -5240,6 +6492,319 @@
         <w:t>Figure 8 · Greenway weighs three measures on effect on users, legal certainty, feasibility, risk and time pressure.</w:t>
       </w:r>
     </w:p>
+    <w:p>
+      <w:pPr>
+        <w:spacing w:before="0" w:after="100"/>
+      </w:pPr>
+      <w:r>
+        <w:rPr>
+          <w:b/>
+        </w:rPr>
+        <w:t>Standards, law and risk: real dates and findings</w:t>
+      </w:r>
+    </w:p>
+    <w:tbl>
+      <w:tblPr>
+        <w:tblW w:w="9638" w:type="dxa"/>
+        <w:tblBorders>
+          <w:top w:val="single" w:sz="4" w:space="0" w:color="D5DEE9"/>
+          <w:left w:val="single" w:sz="4" w:space="0" w:color="D5DEE9"/>
+          <w:bottom w:val="single" w:sz="4" w:space="0" w:color="D5DEE9"/>
+          <w:right w:val="single" w:sz="4" w:space="0" w:color="D5DEE9"/>
+          <w:insideH w:val="single" w:sz="4" w:space="0" w:color="D5DEE9"/>
+          <w:insideV w:val="single" w:sz="4" w:space="0" w:color="D5DEE9"/>
+        </w:tblBorders>
+        <w:tblLayout w:type="fixed"/>
+        <w:tblCellMar>
+          <w:top w:w="60" w:type="dxa"/>
+          <w:left w:w="100" w:type="dxa"/>
+          <w:bottom w:w="60" w:type="dxa"/>
+          <w:right w:w="100" w:type="dxa"/>
+        </w:tblCellMar>
+      </w:tblPr>
+      <w:tblGrid>
+        <w:gridCol w:w="2023"/>
+        <w:gridCol w:w="5101"/>
+        <w:gridCol w:w="2514"/>
+      </w:tblGrid>
+      <w:tr>
+        <w:trPr>
+          <w:cantSplit/>
+          <w:tblHeader/>
+        </w:trPr>
+        <w:tc>
+          <w:tcPr>
+            <w:tcW w:type="dxa" w:w="2023"/>
+            <w:shd w:val="clear" w:color="auto" w:fill="E6ECF4"/>
+          </w:tcPr>
+          <w:p>
+            <w:pPr>
+              <w:spacing w:before="0" w:after="0"/>
+            </w:pPr>
+            <w:r>
+              <w:rPr>
+                <w:b/>
+                <w:sz w:val="20"/>
+              </w:rPr>
+              <w:t>Topic</w:t>
+            </w:r>
+          </w:p>
+        </w:tc>
+        <w:tc>
+          <w:tcPr>
+            <w:tcW w:type="dxa" w:w="5101"/>
+            <w:shd w:val="clear" w:color="auto" w:fill="E6ECF4"/>
+          </w:tcPr>
+          <w:p>
+            <w:pPr>
+              <w:spacing w:before="0" w:after="0"/>
+            </w:pPr>
+            <w:r>
+              <w:rPr>
+                <w:b/>
+                <w:sz w:val="20"/>
+              </w:rPr>
+              <w:t>Real finding or rule</w:t>
+            </w:r>
+          </w:p>
+        </w:tc>
+        <w:tc>
+          <w:tcPr>
+            <w:tcW w:type="dxa" w:w="2514"/>
+            <w:shd w:val="clear" w:color="auto" w:fill="E6ECF4"/>
+          </w:tcPr>
+          <w:p>
+            <w:pPr>
+              <w:spacing w:before="0" w:after="0"/>
+            </w:pPr>
+            <w:r>
+              <w:rPr>
+                <w:b/>
+                <w:sz w:val="20"/>
+              </w:rPr>
+              <w:t>What it means for a measure</w:t>
+            </w:r>
+          </w:p>
+        </w:tc>
+      </w:tr>
+      <w:tr>
+        <w:trPr>
+          <w:cantSplit/>
+        </w:trPr>
+        <w:tc>
+          <w:tcPr>
+            <w:tcW w:type="dxa" w:w="2023"/>
+          </w:tcPr>
+          <w:p>
+            <w:pPr>
+              <w:spacing w:before="0" w:after="0"/>
+            </w:pPr>
+            <w:r>
+              <w:rPr>
+                <w:sz w:val="20"/>
+              </w:rPr>
+              <w:t>The European Accessibility Act</w:t>
+            </w:r>
+          </w:p>
+        </w:tc>
+        <w:tc>
+          <w:tcPr>
+            <w:tcW w:type="dxa" w:w="5101"/>
+          </w:tcPr>
+          <w:p>
+            <w:pPr>
+              <w:spacing w:before="0" w:after="0"/>
+            </w:pPr>
+            <w:r>
+              <w:rPr>
+                <w:sz w:val="20"/>
+              </w:rPr>
+              <w:t>Directive (EU) 2019/882 applies from 28 June 2025 to many products and services, among them e-commerce and consumer banking; providers have to publish an accessibility statement (European Union 2019, commentary as reported).</w:t>
+            </w:r>
+          </w:p>
+        </w:tc>
+        <w:tc>
+          <w:tcPr>
+            <w:tcW w:type="dxa" w:w="2514"/>
+          </w:tcPr>
+          <w:p>
+            <w:pPr>
+              <w:spacing w:before="0" w:after="0"/>
+            </w:pPr>
+            <w:r>
+              <w:rPr>
+                <w:sz w:val="20"/>
+              </w:rPr>
+              <w:t>A legal date has passed: the question is no longer whether but how far a service complies.</w:t>
+            </w:r>
+          </w:p>
+        </w:tc>
+      </w:tr>
+      <w:tr>
+        <w:trPr>
+          <w:cantSplit/>
+        </w:trPr>
+        <w:tc>
+          <w:tcPr>
+            <w:tcW w:type="dxa" w:w="2023"/>
+          </w:tcPr>
+          <w:p>
+            <w:pPr>
+              <w:spacing w:before="0" w:after="0"/>
+            </w:pPr>
+            <w:r>
+              <w:rPr>
+                <w:sz w:val="20"/>
+              </w:rPr>
+              <w:t>The public sector</w:t>
+            </w:r>
+          </w:p>
+        </w:tc>
+        <w:tc>
+          <w:tcPr>
+            <w:tcW w:type="dxa" w:w="5101"/>
+          </w:tcPr>
+          <w:p>
+            <w:pPr>
+              <w:spacing w:before="0" w:after="0"/>
+            </w:pPr>
+            <w:r>
+              <w:rPr>
+                <w:sz w:val="20"/>
+              </w:rPr>
+              <w:t>The Web Accessibility Directive (EU) 2016/2102 requires public bodies to make websites and apps accessible and to publish an accessibility statement.</w:t>
+            </w:r>
+          </w:p>
+        </w:tc>
+        <w:tc>
+          <w:tcPr>
+            <w:tcW w:type="dxa" w:w="2514"/>
+          </w:tcPr>
+          <w:p>
+            <w:pPr>
+              <w:spacing w:before="0" w:after="0"/>
+            </w:pPr>
+            <w:r>
+              <w:rPr>
+                <w:sz w:val="20"/>
+              </w:rPr>
+              <w:t>A public service has a longer duty than a private one.</w:t>
+            </w:r>
+          </w:p>
+        </w:tc>
+      </w:tr>
+      <w:tr>
+        <w:trPr>
+          <w:cantSplit/>
+        </w:trPr>
+        <w:tc>
+          <w:tcPr>
+            <w:tcW w:type="dxa" w:w="2023"/>
+          </w:tcPr>
+          <w:p>
+            <w:pPr>
+              <w:spacing w:before="0" w:after="0"/>
+            </w:pPr>
+            <w:r>
+              <w:rPr>
+                <w:sz w:val="20"/>
+              </w:rPr>
+              <w:t>The state of the web</w:t>
+            </w:r>
+          </w:p>
+        </w:tc>
+        <w:tc>
+          <w:tcPr>
+            <w:tcW w:type="dxa" w:w="5101"/>
+          </w:tcPr>
+          <w:p>
+            <w:pPr>
+              <w:spacing w:before="0" w:after="0"/>
+            </w:pPr>
+            <w:r>
+              <w:rPr>
+                <w:sz w:val="20"/>
+              </w:rPr>
+              <w:t>94.8% of the million most visited home pages had detectable failures in 2025 (WebAIM 2025, as reported); pages that used ARIA had over twice as many detected errors on average (57 against 27).</w:t>
+            </w:r>
+          </w:p>
+        </w:tc>
+        <w:tc>
+          <w:tcPr>
+            <w:tcW w:type="dxa" w:w="2514"/>
+          </w:tcPr>
+          <w:p>
+            <w:pPr>
+              <w:spacing w:before="0" w:after="0"/>
+            </w:pPr>
+            <w:r>
+              <w:rPr>
+                <w:sz w:val="20"/>
+              </w:rPr>
+              <w:t>Do not add ARIA to repair a design: start with plain HTML and test.</w:t>
+            </w:r>
+          </w:p>
+        </w:tc>
+      </w:tr>
+      <w:tr>
+        <w:trPr>
+          <w:cantSplit/>
+        </w:trPr>
+        <w:tc>
+          <w:tcPr>
+            <w:tcW w:type="dxa" w:w="2023"/>
+          </w:tcPr>
+          <w:p>
+            <w:pPr>
+              <w:spacing w:before="0" w:after="0"/>
+            </w:pPr>
+            <w:r>
+              <w:rPr>
+                <w:sz w:val="20"/>
+              </w:rPr>
+              <w:t>Early or late</w:t>
+            </w:r>
+          </w:p>
+        </w:tc>
+        <w:tc>
+          <w:tcPr>
+            <w:tcW w:type="dxa" w:w="5101"/>
+          </w:tcPr>
+          <w:p>
+            <w:pPr>
+              <w:spacing w:before="0" w:after="0"/>
+            </w:pPr>
+            <w:r>
+              <w:rPr>
+                <w:sz w:val="20"/>
+              </w:rPr>
+              <w:t>A barrier that is found in the first test costs less to remove than one that is found after release (practice of the standard; no measured figure is printed here).</w:t>
+            </w:r>
+          </w:p>
+        </w:tc>
+        <w:tc>
+          <w:tcPr>
+            <w:tcW w:type="dxa" w:w="2514"/>
+          </w:tcPr>
+          <w:p>
+            <w:pPr>
+              <w:spacing w:before="0" w:after="0"/>
+            </w:pPr>
+            <w:r>
+              <w:rPr>
+                <w:sz w:val="20"/>
+              </w:rPr>
+              <w:t>Put the check in the definition of done.</w:t>
+            </w:r>
+          </w:p>
+        </w:tc>
+      </w:tr>
+    </w:tbl>
+    <w:p>
+      <w:pPr>
+        <w:spacing w:before="0" w:after="80"/>
+      </w:pPr>
+    </w:p>
     <w:tbl>
       <w:tblPr>
         <w:tblW w:w="9598" w:type="dxa"/>
@@ -5289,7 +6854,7 @@
             </w:pPr>
             <w:r>
               <w:rPr/>
-              <w:t>Greenway, Kofi, Liv, Arjun, Sanne and Henrik are made up for this example. The principles and levels follow WCAG 2.2; the dates follow the European Accessibility Act (Directive (EU) 2019/882) and the Web Accessibility Directive (2016/2102). Check the current state of the law before a course run. Rating options on the same criteria follows Gibbons (2018); the five criteria are the ones the plan names for the case study.</w:t>
+              <w:t>Greenway, Kofi, Liv, Arjun, Sanne and Henrik are made up for this example. The principles and levels follow WCAG 2.2; the dates follow the European Accessibility Act (Directive (EU) 2019/882) and the Web Accessibility Directive (2016/2102). Check the current state of the law before a course run. Rating options on the same criteria follows Gibbons (2018); the five criteria are the ones the plan names for the case study. The findings in the table of real evidence are real research results, rules and cases; the sources are listed below.</w:t>
             </w:r>
           </w:p>
         </w:tc>
@@ -5478,7 +7043,7 @@
           <w:color w:val="556274"/>
           <w:sz w:val="18"/>
         </w:rPr>
-        <w:t>WCAG 2.2 · EU 2019 (European Accessibility Act) · EU 2016 (Web Accessibility Directive) · Gibbons 2018</w:t>
+        <w:t>WCAG 2.2 · EU 2019 (European Accessibility Act) · EU 2016 (Web Accessibility Directive) · Gibbons 2018 · WebAIM 2025</w:t>
       </w:r>
     </w:p>
     <w:p>
@@ -5785,6 +7350,266 @@
         <w:t>Figure 10 · The layers of an accessibility architecture, from a guiding vision to every page.</w:t>
       </w:r>
     </w:p>
+    <w:p>
+      <w:pPr>
+        <w:spacing w:before="0" w:after="100"/>
+      </w:pPr>
+      <w:r>
+        <w:rPr>
+          <w:b/>
+        </w:rPr>
+        <w:t>Accessibility as quality and responsibility: structures</w:t>
+      </w:r>
+    </w:p>
+    <w:tbl>
+      <w:tblPr>
+        <w:tblW w:w="9638" w:type="dxa"/>
+        <w:tblBorders>
+          <w:top w:val="single" w:sz="4" w:space="0" w:color="D5DEE9"/>
+          <w:left w:val="single" w:sz="4" w:space="0" w:color="D5DEE9"/>
+          <w:bottom w:val="single" w:sz="4" w:space="0" w:color="D5DEE9"/>
+          <w:right w:val="single" w:sz="4" w:space="0" w:color="D5DEE9"/>
+          <w:insideH w:val="single" w:sz="4" w:space="0" w:color="D5DEE9"/>
+          <w:insideV w:val="single" w:sz="4" w:space="0" w:color="D5DEE9"/>
+        </w:tblBorders>
+        <w:tblLayout w:type="fixed"/>
+        <w:tblCellMar>
+          <w:top w:w="60" w:type="dxa"/>
+          <w:left w:w="100" w:type="dxa"/>
+          <w:bottom w:w="60" w:type="dxa"/>
+          <w:right w:w="100" w:type="dxa"/>
+        </w:tblCellMar>
+      </w:tblPr>
+      <w:tblGrid>
+        <w:gridCol w:w="1710"/>
+        <w:gridCol w:w="4642"/>
+        <w:gridCol w:w="3286"/>
+      </w:tblGrid>
+      <w:tr>
+        <w:trPr>
+          <w:cantSplit/>
+          <w:tblHeader/>
+        </w:trPr>
+        <w:tc>
+          <w:tcPr>
+            <w:tcW w:type="dxa" w:w="1710"/>
+            <w:shd w:val="clear" w:color="auto" w:fill="E6ECF4"/>
+          </w:tcPr>
+          <w:p>
+            <w:pPr>
+              <w:spacing w:before="0" w:after="0"/>
+            </w:pPr>
+            <w:r>
+              <w:rPr>
+                <w:b/>
+                <w:sz w:val="20"/>
+              </w:rPr>
+              <w:t>Part</w:t>
+            </w:r>
+          </w:p>
+        </w:tc>
+        <w:tc>
+          <w:tcPr>
+            <w:tcW w:type="dxa" w:w="4642"/>
+            <w:shd w:val="clear" w:color="auto" w:fill="E6ECF4"/>
+          </w:tcPr>
+          <w:p>
+            <w:pPr>
+              <w:spacing w:before="0" w:after="0"/>
+            </w:pPr>
+            <w:r>
+              <w:rPr>
+                <w:b/>
+                <w:sz w:val="20"/>
+              </w:rPr>
+              <w:t>Real example or rule</w:t>
+            </w:r>
+          </w:p>
+        </w:tc>
+        <w:tc>
+          <w:tcPr>
+            <w:tcW w:type="dxa" w:w="3286"/>
+            <w:shd w:val="clear" w:color="auto" w:fill="E6ECF4"/>
+          </w:tcPr>
+          <w:p>
+            <w:pPr>
+              <w:spacing w:before="0" w:after="0"/>
+            </w:pPr>
+            <w:r>
+              <w:rPr>
+                <w:b/>
+                <w:sz w:val="20"/>
+              </w:rPr>
+              <w:t>What it means</w:t>
+            </w:r>
+          </w:p>
+        </w:tc>
+      </w:tr>
+      <w:tr>
+        <w:trPr>
+          <w:cantSplit/>
+        </w:trPr>
+        <w:tc>
+          <w:tcPr>
+            <w:tcW w:type="dxa" w:w="1710"/>
+          </w:tcPr>
+          <w:p>
+            <w:pPr>
+              <w:spacing w:before="0" w:after="0"/>
+            </w:pPr>
+            <w:r>
+              <w:rPr>
+                <w:sz w:val="20"/>
+              </w:rPr>
+              <w:t>A target level</w:t>
+            </w:r>
+          </w:p>
+        </w:tc>
+        <w:tc>
+          <w:tcPr>
+            <w:tcW w:type="dxa" w:w="4642"/>
+          </w:tcPr>
+          <w:p>
+            <w:pPr>
+              <w:spacing w:before="0" w:after="0"/>
+            </w:pPr>
+            <w:r>
+              <w:rPr>
+                <w:sz w:val="20"/>
+              </w:rPr>
+              <w:t>WCAG 2.2 level AA is the usual target in law and procurement; EN 301 549 is the European standard behind the Accessibility Act.</w:t>
+            </w:r>
+          </w:p>
+        </w:tc>
+        <w:tc>
+          <w:tcPr>
+            <w:tcW w:type="dxa" w:w="3286"/>
+          </w:tcPr>
+          <w:p>
+            <w:pPr>
+              <w:spacing w:before="0" w:after="0"/>
+            </w:pPr>
+            <w:r>
+              <w:rPr>
+                <w:sz w:val="20"/>
+              </w:rPr>
+              <w:t>Name the level once, in the strategy.</w:t>
+            </w:r>
+          </w:p>
+        </w:tc>
+      </w:tr>
+      <w:tr>
+        <w:trPr>
+          <w:cantSplit/>
+        </w:trPr>
+        <w:tc>
+          <w:tcPr>
+            <w:tcW w:type="dxa" w:w="1710"/>
+          </w:tcPr>
+          <w:p>
+            <w:pPr>
+              <w:spacing w:before="0" w:after="0"/>
+            </w:pPr>
+            <w:r>
+              <w:rPr>
+                <w:sz w:val="20"/>
+              </w:rPr>
+              <w:t>Mismatch, not defect</w:t>
+            </w:r>
+          </w:p>
+        </w:tc>
+        <w:tc>
+          <w:tcPr>
+            <w:tcW w:type="dxa" w:w="4642"/>
+          </w:tcPr>
+          <w:p>
+            <w:pPr>
+              <w:spacing w:before="0" w:after="0"/>
+            </w:pPr>
+            <w:r>
+              <w:rPr>
+                <w:sz w:val="20"/>
+              </w:rPr>
+              <w:t>Holmes treats disability as a mismatch between a person and a design (Holmes 2018).</w:t>
+            </w:r>
+          </w:p>
+        </w:tc>
+        <w:tc>
+          <w:tcPr>
+            <w:tcW w:type="dxa" w:w="3286"/>
+          </w:tcPr>
+          <w:p>
+            <w:pPr>
+              <w:spacing w:before="0" w:after="0"/>
+            </w:pPr>
+            <w:r>
+              <w:rPr>
+                <w:sz w:val="20"/>
+              </w:rPr>
+              <w:t>Put the responsibility on the design, and measure it.</w:t>
+            </w:r>
+          </w:p>
+        </w:tc>
+      </w:tr>
+      <w:tr>
+        <w:trPr>
+          <w:cantSplit/>
+        </w:trPr>
+        <w:tc>
+          <w:tcPr>
+            <w:tcW w:type="dxa" w:w="1710"/>
+          </w:tcPr>
+          <w:p>
+            <w:pPr>
+              <w:spacing w:before="0" w:after="0"/>
+            </w:pPr>
+            <w:r>
+              <w:rPr>
+                <w:sz w:val="20"/>
+              </w:rPr>
+              <w:t>A duty to report</w:t>
+            </w:r>
+          </w:p>
+        </w:tc>
+        <w:tc>
+          <w:tcPr>
+            <w:tcW w:type="dxa" w:w="4642"/>
+          </w:tcPr>
+          <w:p>
+            <w:pPr>
+              <w:spacing w:before="0" w:after="0"/>
+            </w:pPr>
+            <w:r>
+              <w:rPr>
+                <w:sz w:val="20"/>
+              </w:rPr>
+              <w:t>Both European directives ask for an accessibility statement (European Union 2016 and 2019).</w:t>
+            </w:r>
+          </w:p>
+        </w:tc>
+        <w:tc>
+          <w:tcPr>
+            <w:tcW w:type="dxa" w:w="3286"/>
+          </w:tcPr>
+          <w:p>
+            <w:pPr>
+              <w:spacing w:before="0" w:after="0"/>
+            </w:pPr>
+            <w:r>
+              <w:rPr>
+                <w:sz w:val="20"/>
+              </w:rPr>
+              <w:t>Publish what is not yet accessible, with a contact for barriers.</w:t>
+            </w:r>
+          </w:p>
+        </w:tc>
+      </w:tr>
+    </w:tbl>
+    <w:p>
+      <w:pPr>
+        <w:spacing w:before="0" w:after="80"/>
+      </w:pPr>
+    </w:p>
     <w:tbl>
       <w:tblPr>
         <w:tblW w:w="9598" w:type="dxa"/>
@@ -5834,7 +7659,7 @@
             </w:pPr>
             <w:r>
               <w:rPr/>
-              <w:t>Greenway, Kofi, Liv, Arjun, Sanne and Henrik are made up for this example. Inclusion as a design approach follows Holmes (2018).</w:t>
+              <w:t>Greenway, Kofi, Liv, Arjun, Sanne and Henrik are made up for this example. Inclusion as a design approach follows Holmes (2018). The findings in the table of real evidence are real research results, rules and cases; the sources are listed below.</w:t>
             </w:r>
           </w:p>
         </w:tc>
@@ -6023,7 +7848,7 @@
           <w:color w:val="556274"/>
           <w:sz w:val="18"/>
         </w:rPr>
-        <w:t>Holmes 2018 · EU 2016 (Web Accessibility Directive)</w:t>
+        <w:t>Holmes 2018 · EU 2016 (Web Accessibility Directive) · WCAG 2.2 · EU 2019 (European Accessibility Act)</w:t>
       </w:r>
     </w:p>
     <w:p>
@@ -6516,6 +8341,319 @@
         <w:spacing w:before="0" w:after="80"/>
       </w:pPr>
     </w:p>
+    <w:p>
+      <w:pPr>
+        <w:spacing w:before="0" w:after="100"/>
+      </w:pPr>
+      <w:r>
+        <w:rPr>
+          <w:b/>
+        </w:rPr>
+        <w:t>Conflicts of accessibility, with evidence</w:t>
+      </w:r>
+    </w:p>
+    <w:tbl>
+      <w:tblPr>
+        <w:tblW w:w="9638" w:type="dxa"/>
+        <w:tblBorders>
+          <w:top w:val="single" w:sz="4" w:space="0" w:color="D5DEE9"/>
+          <w:left w:val="single" w:sz="4" w:space="0" w:color="D5DEE9"/>
+          <w:bottom w:val="single" w:sz="4" w:space="0" w:color="D5DEE9"/>
+          <w:right w:val="single" w:sz="4" w:space="0" w:color="D5DEE9"/>
+          <w:insideH w:val="single" w:sz="4" w:space="0" w:color="D5DEE9"/>
+          <w:insideV w:val="single" w:sz="4" w:space="0" w:color="D5DEE9"/>
+        </w:tblBorders>
+        <w:tblLayout w:type="fixed"/>
+        <w:tblCellMar>
+          <w:top w:w="60" w:type="dxa"/>
+          <w:left w:w="100" w:type="dxa"/>
+          <w:bottom w:w="60" w:type="dxa"/>
+          <w:right w:w="100" w:type="dxa"/>
+        </w:tblCellMar>
+      </w:tblPr>
+      <w:tblGrid>
+        <w:gridCol w:w="2354"/>
+        <w:gridCol w:w="4385"/>
+        <w:gridCol w:w="2899"/>
+      </w:tblGrid>
+      <w:tr>
+        <w:trPr>
+          <w:cantSplit/>
+          <w:tblHeader/>
+        </w:trPr>
+        <w:tc>
+          <w:tcPr>
+            <w:tcW w:type="dxa" w:w="2354"/>
+            <w:shd w:val="clear" w:color="auto" w:fill="E6ECF4"/>
+          </w:tcPr>
+          <w:p>
+            <w:pPr>
+              <w:spacing w:before="0" w:after="0"/>
+            </w:pPr>
+            <w:r>
+              <w:rPr>
+                <w:b/>
+                <w:sz w:val="20"/>
+              </w:rPr>
+              <w:t>Conflict</w:t>
+            </w:r>
+          </w:p>
+        </w:tc>
+        <w:tc>
+          <w:tcPr>
+            <w:tcW w:type="dxa" w:w="4385"/>
+            <w:shd w:val="clear" w:color="auto" w:fill="E6ECF4"/>
+          </w:tcPr>
+          <w:p>
+            <w:pPr>
+              <w:spacing w:before="0" w:after="0"/>
+            </w:pPr>
+            <w:r>
+              <w:rPr>
+                <w:b/>
+                <w:sz w:val="20"/>
+              </w:rPr>
+              <w:t>What the evidence says</w:t>
+            </w:r>
+          </w:p>
+        </w:tc>
+        <w:tc>
+          <w:tcPr>
+            <w:tcW w:type="dxa" w:w="2899"/>
+            <w:shd w:val="clear" w:color="auto" w:fill="E6ECF4"/>
+          </w:tcPr>
+          <w:p>
+            <w:pPr>
+              <w:spacing w:before="0" w:after="0"/>
+            </w:pPr>
+            <w:r>
+              <w:rPr>
+                <w:b/>
+                <w:sz w:val="20"/>
+              </w:rPr>
+              <w:t>A way to decide</w:t>
+            </w:r>
+          </w:p>
+        </w:tc>
+      </w:tr>
+      <w:tr>
+        <w:trPr>
+          <w:cantSplit/>
+        </w:trPr>
+        <w:tc>
+          <w:tcPr>
+            <w:tcW w:type="dxa" w:w="2354"/>
+          </w:tcPr>
+          <w:p>
+            <w:pPr>
+              <w:spacing w:before="0" w:after="0"/>
+            </w:pPr>
+            <w:r>
+              <w:rPr>
+                <w:sz w:val="20"/>
+              </w:rPr>
+              <w:t>Brand look against legibility</w:t>
+            </w:r>
+          </w:p>
+        </w:tc>
+        <w:tc>
+          <w:tcPr>
+            <w:tcW w:type="dxa" w:w="4385"/>
+          </w:tcPr>
+          <w:p>
+            <w:pPr>
+              <w:spacing w:before="0" w:after="0"/>
+            </w:pPr>
+            <w:r>
+              <w:rPr>
+                <w:sz w:val="20"/>
+              </w:rPr>
+              <w:t>Low-contrast text was the most common failure on the home pages analysed in 2025 (WebAIM 2025, as reported).</w:t>
+            </w:r>
+          </w:p>
+        </w:tc>
+        <w:tc>
+          <w:tcPr>
+            <w:tcW w:type="dxa" w:w="2899"/>
+          </w:tcPr>
+          <w:p>
+            <w:pPr>
+              <w:spacing w:before="0" w:after="0"/>
+            </w:pPr>
+            <w:r>
+              <w:rPr>
+                <w:sz w:val="20"/>
+              </w:rPr>
+              <w:t>Keep the brand in large areas and use a darker shade for text.</w:t>
+            </w:r>
+          </w:p>
+        </w:tc>
+      </w:tr>
+      <w:tr>
+        <w:trPr>
+          <w:cantSplit/>
+        </w:trPr>
+        <w:tc>
+          <w:tcPr>
+            <w:tcW w:type="dxa" w:w="2354"/>
+          </w:tcPr>
+          <w:p>
+            <w:pPr>
+              <w:spacing w:before="0" w:after="0"/>
+            </w:pPr>
+            <w:r>
+              <w:rPr>
+                <w:sz w:val="20"/>
+              </w:rPr>
+              <w:t>One standard against diverse users</w:t>
+            </w:r>
+          </w:p>
+        </w:tc>
+        <w:tc>
+          <w:tcPr>
+            <w:tcW w:type="dxa" w:w="4385"/>
+          </w:tcPr>
+          <w:p>
+            <w:pPr>
+              <w:spacing w:before="0" w:after="0"/>
+            </w:pPr>
+            <w:r>
+              <w:rPr>
+                <w:sz w:val="20"/>
+              </w:rPr>
+              <w:t>Needs differ across the spectrum of people (Holmes 2018).</w:t>
+            </w:r>
+          </w:p>
+        </w:tc>
+        <w:tc>
+          <w:tcPr>
+            <w:tcW w:type="dxa" w:w="2899"/>
+          </w:tcPr>
+          <w:p>
+            <w:pPr>
+              <w:spacing w:before="0" w:after="0"/>
+            </w:pPr>
+            <w:r>
+              <w:rPr>
+                <w:sz w:val="20"/>
+              </w:rPr>
+              <w:t>Set defaults that work for most and offer options for those who need them.</w:t>
+            </w:r>
+          </w:p>
+        </w:tc>
+      </w:tr>
+      <w:tr>
+        <w:trPr>
+          <w:cantSplit/>
+        </w:trPr>
+        <w:tc>
+          <w:tcPr>
+            <w:tcW w:type="dxa" w:w="2354"/>
+          </w:tcPr>
+          <w:p>
+            <w:pPr>
+              <w:spacing w:before="0" w:after="0"/>
+            </w:pPr>
+            <w:r>
+              <w:rPr>
+                <w:sz w:val="20"/>
+              </w:rPr>
+              <w:t>Effort against reach</w:t>
+            </w:r>
+          </w:p>
+        </w:tc>
+        <w:tc>
+          <w:tcPr>
+            <w:tcW w:type="dxa" w:w="4385"/>
+          </w:tcPr>
+          <w:p>
+            <w:pPr>
+              <w:spacing w:before="0" w:after="0"/>
+            </w:pPr>
+            <w:r>
+              <w:rPr>
+                <w:sz w:val="20"/>
+              </w:rPr>
+              <w:t>69% of the shoppers with access needs in one survey said they click away from sites with barriers (Click-Away Pound 2019, as reported).</w:t>
+            </w:r>
+          </w:p>
+        </w:tc>
+        <w:tc>
+          <w:tcPr>
+            <w:tcW w:type="dxa" w:w="2899"/>
+          </w:tcPr>
+          <w:p>
+            <w:pPr>
+              <w:spacing w:before="0" w:after="0"/>
+            </w:pPr>
+            <w:r>
+              <w:rPr>
+                <w:sz w:val="20"/>
+              </w:rPr>
+              <w:t>Repair the barriers in the busiest journeys first.</w:t>
+            </w:r>
+          </w:p>
+        </w:tc>
+      </w:tr>
+      <w:tr>
+        <w:trPr>
+          <w:cantSplit/>
+        </w:trPr>
+        <w:tc>
+          <w:tcPr>
+            <w:tcW w:type="dxa" w:w="2354"/>
+          </w:tcPr>
+          <w:p>
+            <w:pPr>
+              <w:spacing w:before="0" w:after="0"/>
+            </w:pPr>
+            <w:r>
+              <w:rPr>
+                <w:sz w:val="20"/>
+              </w:rPr>
+              <w:t>Legal certainty against feasibility this year</w:t>
+            </w:r>
+          </w:p>
+        </w:tc>
+        <w:tc>
+          <w:tcPr>
+            <w:tcW w:type="dxa" w:w="4385"/>
+          </w:tcPr>
+          <w:p>
+            <w:pPr>
+              <w:spacing w:before="0" w:after="0"/>
+            </w:pPr>
+            <w:r>
+              <w:rPr>
+                <w:sz w:val="20"/>
+              </w:rPr>
+              <w:t>The European Accessibility Act applies from 28 June 2025 (European Union 2019).</w:t>
+            </w:r>
+          </w:p>
+        </w:tc>
+        <w:tc>
+          <w:tcPr>
+            <w:tcW w:type="dxa" w:w="2899"/>
+          </w:tcPr>
+          <w:p>
+            <w:pPr>
+              <w:spacing w:before="0" w:after="0"/>
+            </w:pPr>
+            <w:r>
+              <w:rPr>
+                <w:sz w:val="20"/>
+              </w:rPr>
+              <w:t>Rank the failures by legal and human risk and fix those first.</w:t>
+            </w:r>
+          </w:p>
+        </w:tc>
+      </w:tr>
+    </w:tbl>
+    <w:p>
+      <w:pPr>
+        <w:spacing w:before="0" w:after="80"/>
+      </w:pPr>
+    </w:p>
     <w:tbl>
       <w:tblPr>
         <w:tblW w:w="9598" w:type="dxa"/>
@@ -6565,7 +8703,7 @@
             </w:pPr>
             <w:r>
               <w:rPr/>
-              <w:t>Greenway, Kofi, Liv, Arjun, Sanne and Henrik are made up for this example. The conflicts are a reading of the example, not a rule for every product.</w:t>
+              <w:t>Greenway, Kofi, Liv, Arjun, Sanne and Henrik are made up for this example. The conflicts are a reading of the example, not a rule for every product. The findings in the table of real evidence are real research results, rules and cases; the sources are listed below.</w:t>
             </w:r>
           </w:p>
         </w:tc>
@@ -6754,7 +8892,7 @@
           <w:color w:val="556274"/>
           <w:sz w:val="18"/>
         </w:rPr>
-        <w:t>EU 2019 (European Accessibility Act) · Holmes 2018</w:t>
+        <w:t>EU 2019 (European Accessibility Act) · Holmes 2018 · WebAIM 2025 · Click-Away Pound 2019</w:t>
       </w:r>
     </w:p>
     <w:p>
@@ -7300,6 +9438,266 @@
         <w:spacing w:before="0" w:after="80"/>
       </w:pPr>
     </w:p>
+    <w:p>
+      <w:pPr>
+        <w:spacing w:before="0" w:after="100"/>
+      </w:pPr>
+      <w:r>
+        <w:rPr>
+          <w:b/>
+        </w:rPr>
+        <w:t>Owning accessibility: real rules</w:t>
+      </w:r>
+    </w:p>
+    <w:tbl>
+      <w:tblPr>
+        <w:tblW w:w="9638" w:type="dxa"/>
+        <w:tblBorders>
+          <w:top w:val="single" w:sz="4" w:space="0" w:color="D5DEE9"/>
+          <w:left w:val="single" w:sz="4" w:space="0" w:color="D5DEE9"/>
+          <w:bottom w:val="single" w:sz="4" w:space="0" w:color="D5DEE9"/>
+          <w:right w:val="single" w:sz="4" w:space="0" w:color="D5DEE9"/>
+          <w:insideH w:val="single" w:sz="4" w:space="0" w:color="D5DEE9"/>
+          <w:insideV w:val="single" w:sz="4" w:space="0" w:color="D5DEE9"/>
+        </w:tblBorders>
+        <w:tblLayout w:type="fixed"/>
+        <w:tblCellMar>
+          <w:top w:w="60" w:type="dxa"/>
+          <w:left w:w="100" w:type="dxa"/>
+          <w:bottom w:w="60" w:type="dxa"/>
+          <w:right w:w="100" w:type="dxa"/>
+        </w:tblCellMar>
+      </w:tblPr>
+      <w:tblGrid>
+        <w:gridCol w:w="1981"/>
+        <w:gridCol w:w="4606"/>
+        <w:gridCol w:w="3051"/>
+      </w:tblGrid>
+      <w:tr>
+        <w:trPr>
+          <w:cantSplit/>
+          <w:tblHeader/>
+        </w:trPr>
+        <w:tc>
+          <w:tcPr>
+            <w:tcW w:type="dxa" w:w="1981"/>
+            <w:shd w:val="clear" w:color="auto" w:fill="E6ECF4"/>
+          </w:tcPr>
+          <w:p>
+            <w:pPr>
+              <w:spacing w:before="0" w:after="0"/>
+            </w:pPr>
+            <w:r>
+              <w:rPr>
+                <w:b/>
+                <w:sz w:val="20"/>
+              </w:rPr>
+              <w:t>Part</w:t>
+            </w:r>
+          </w:p>
+        </w:tc>
+        <w:tc>
+          <w:tcPr>
+            <w:tcW w:type="dxa" w:w="4606"/>
+            <w:shd w:val="clear" w:color="auto" w:fill="E6ECF4"/>
+          </w:tcPr>
+          <w:p>
+            <w:pPr>
+              <w:spacing w:before="0" w:after="0"/>
+            </w:pPr>
+            <w:r>
+              <w:rPr>
+                <w:b/>
+                <w:sz w:val="20"/>
+              </w:rPr>
+              <w:t>Real rule or source</w:t>
+            </w:r>
+          </w:p>
+        </w:tc>
+        <w:tc>
+          <w:tcPr>
+            <w:tcW w:type="dxa" w:w="3051"/>
+            <w:shd w:val="clear" w:color="auto" w:fill="E6ECF4"/>
+          </w:tcPr>
+          <w:p>
+            <w:pPr>
+              <w:spacing w:before="0" w:after="0"/>
+            </w:pPr>
+            <w:r>
+              <w:rPr>
+                <w:b/>
+                <w:sz w:val="20"/>
+              </w:rPr>
+              <w:t>What it means</w:t>
+            </w:r>
+          </w:p>
+        </w:tc>
+      </w:tr>
+      <w:tr>
+        <w:trPr>
+          <w:cantSplit/>
+        </w:trPr>
+        <w:tc>
+          <w:tcPr>
+            <w:tcW w:type="dxa" w:w="1981"/>
+          </w:tcPr>
+          <w:p>
+            <w:pPr>
+              <w:spacing w:before="0" w:after="0"/>
+            </w:pPr>
+            <w:r>
+              <w:rPr>
+                <w:sz w:val="20"/>
+              </w:rPr>
+              <w:t>Owner and target</w:t>
+            </w:r>
+          </w:p>
+        </w:tc>
+        <w:tc>
+          <w:tcPr>
+            <w:tcW w:type="dxa" w:w="4606"/>
+          </w:tcPr>
+          <w:p>
+            <w:pPr>
+              <w:spacing w:before="0" w:after="0"/>
+            </w:pPr>
+            <w:r>
+              <w:rPr>
+                <w:sz w:val="20"/>
+              </w:rPr>
+              <w:t>Public bodies in the EU must publish an accessibility statement (European Union 2016).</w:t>
+            </w:r>
+          </w:p>
+        </w:tc>
+        <w:tc>
+          <w:tcPr>
+            <w:tcW w:type="dxa" w:w="3051"/>
+          </w:tcPr>
+          <w:p>
+            <w:pPr>
+              <w:spacing w:before="0" w:after="0"/>
+            </w:pPr>
+            <w:r>
+              <w:rPr>
+                <w:sz w:val="20"/>
+              </w:rPr>
+              <w:t>Name the owner and the level in a published statement.</w:t>
+            </w:r>
+          </w:p>
+        </w:tc>
+      </w:tr>
+      <w:tr>
+        <w:trPr>
+          <w:cantSplit/>
+        </w:trPr>
+        <w:tc>
+          <w:tcPr>
+            <w:tcW w:type="dxa" w:w="1981"/>
+          </w:tcPr>
+          <w:p>
+            <w:pPr>
+              <w:spacing w:before="0" w:after="0"/>
+            </w:pPr>
+            <w:r>
+              <w:rPr>
+                <w:sz w:val="20"/>
+              </w:rPr>
+              <w:t>Check in every release</w:t>
+            </w:r>
+          </w:p>
+        </w:tc>
+        <w:tc>
+          <w:tcPr>
+            <w:tcW w:type="dxa" w:w="4606"/>
+          </w:tcPr>
+          <w:p>
+            <w:pPr>
+              <w:spacing w:before="0" w:after="0"/>
+            </w:pPr>
+            <w:r>
+              <w:rPr>
+                <w:sz w:val="20"/>
+              </w:rPr>
+              <w:t>WCAG 2.2 gives testable success criteria for each requirement.</w:t>
+            </w:r>
+          </w:p>
+        </w:tc>
+        <w:tc>
+          <w:tcPr>
+            <w:tcW w:type="dxa" w:w="3051"/>
+          </w:tcPr>
+          <w:p>
+            <w:pPr>
+              <w:spacing w:before="0" w:after="0"/>
+            </w:pPr>
+            <w:r>
+              <w:rPr>
+                <w:sz w:val="20"/>
+              </w:rPr>
+              <w:t>Put the testable criteria into the definition of done.</w:t>
+            </w:r>
+          </w:p>
+        </w:tc>
+      </w:tr>
+      <w:tr>
+        <w:trPr>
+          <w:cantSplit/>
+        </w:trPr>
+        <w:tc>
+          <w:tcPr>
+            <w:tcW w:type="dxa" w:w="1981"/>
+          </w:tcPr>
+          <w:p>
+            <w:pPr>
+              <w:spacing w:before="0" w:after="0"/>
+            </w:pPr>
+            <w:r>
+              <w:rPr>
+                <w:sz w:val="20"/>
+              </w:rPr>
+              <w:t>Procurement</w:t>
+            </w:r>
+          </w:p>
+        </w:tc>
+        <w:tc>
+          <w:tcPr>
+            <w:tcW w:type="dxa" w:w="4606"/>
+          </w:tcPr>
+          <w:p>
+            <w:pPr>
+              <w:spacing w:before="0" w:after="0"/>
+            </w:pPr>
+            <w:r>
+              <w:rPr>
+                <w:sz w:val="20"/>
+              </w:rPr>
+              <w:t>The European standard EN 301 549 sets accessibility requirements for the procurement of ICT products and services.</w:t>
+            </w:r>
+          </w:p>
+        </w:tc>
+        <w:tc>
+          <w:tcPr>
+            <w:tcW w:type="dxa" w:w="3051"/>
+          </w:tcPr>
+          <w:p>
+            <w:pPr>
+              <w:spacing w:before="0" w:after="0"/>
+            </w:pPr>
+            <w:r>
+              <w:rPr>
+                <w:sz w:val="20"/>
+              </w:rPr>
+              <w:t>Write the level into every supplier contract.</w:t>
+            </w:r>
+          </w:p>
+        </w:tc>
+      </w:tr>
+    </w:tbl>
+    <w:p>
+      <w:pPr>
+        <w:spacing w:before="0" w:after="80"/>
+      </w:pPr>
+    </w:p>
     <w:tbl>
       <w:tblPr>
         <w:tblW w:w="9598" w:type="dxa"/>
@@ -7349,7 +9747,7 @@
             </w:pPr>
             <w:r>
               <w:rPr/>
-              <w:t>Greenway, Kofi, Liv, Arjun, Sanne and Henrik are made up for this example. The accessibility statement for public bodies follows the Web Accessibility Directive (2016); deciding with limited information follows Simon (1956); the premortem follows Klein (2007).</w:t>
+              <w:t>Greenway, Kofi, Liv, Arjun, Sanne and Henrik are made up for this example. The accessibility statement for public bodies follows the Web Accessibility Directive (2016); deciding with limited information follows Simon (1956); the premortem follows Klein (2007). The findings in the table of real evidence are real research results, rules and cases; the sources are listed below.</w:t>
             </w:r>
           </w:p>
         </w:tc>
@@ -7538,7 +9936,7 @@
           <w:color w:val="556274"/>
           <w:sz w:val="18"/>
         </w:rPr>
-        <w:t>EU 2016 (Web Accessibility Directive) · Simon 1956 · Klein 2007</w:t>
+        <w:t>EU 2016 (Web Accessibility Directive) · Simon 1956 · Klein 2007 · WCAG 2.2</w:t>
       </w:r>
     </w:p>
     <w:p>
@@ -8211,6 +10609,30 @@
         <w:rPr>
           <w:sz w:val="19"/>
         </w:rPr>
+        <w:t>World Health Organization (2022). Global report on health equity for persons with disabilities. Geneva: WHO. (About 1.3 billion people, roughly 16% of the world's population, live with a significant disability.)</w:t>
+      </w:r>
+    </w:p>
+    <w:p>
+      <w:pPr>
+        <w:spacing w:before="0" w:after="80"/>
+        <w:ind w:left="283" w:hanging="283"/>
+      </w:pPr>
+      <w:r>
+        <w:rPr>
+          <w:sz w:val="19"/>
+        </w:rPr>
+        <w:t>Click-Away Pound (2019). The Click-Away Pound Survey 2019, Freeney Williams Ltd. https://clickawaypound.com/ (69% of online shoppers with access needs said they click away from websites that are difficult to use; only 8% had contacted a site owner about barriers. Figures from the press releases.)</w:t>
+      </w:r>
+    </w:p>
+    <w:p>
+      <w:pPr>
+        <w:spacing w:before="0" w:after="80"/>
+        <w:ind w:left="283" w:hanging="283"/>
+      </w:pPr>
+      <w:r>
+        <w:rPr>
+          <w:sz w:val="19"/>
+        </w:rPr>
         <w:t>W3C (2023). Web Content Accessibility Guidelines (WCAG) 2.2. https://www.w3.org/TR/WCAG22/ (Success criterion 1.4.1 Use of Color: colour must not be the only way to convey information; 1.4.3 Contrast (Minimum) for text.)</w:t>
       </w:r>
     </w:p>
@@ -8223,7 +10645,55 @@
         <w:rPr>
           <w:sz w:val="19"/>
         </w:rPr>
+        <w:t>WebAIM (2025). The WebAIM Million: The 2025 report on the accessibility of the top 1,000,000 home pages. https://webaim.org/projects/million/ (94.8% of the home pages had detectable WCAG 2 failures; low-contrast text was the most common; figures on ARIA and averages from secondary coverage.)</w:t>
+      </w:r>
+    </w:p>
+    <w:p>
+      <w:pPr>
+        <w:spacing w:before="0" w:after="80"/>
+        <w:ind w:left="283" w:hanging="283"/>
+      </w:pPr>
+      <w:r>
+        <w:rPr>
+          <w:sz w:val="19"/>
+        </w:rPr>
+        <w:t>Wong, B. (2011). Color blindness. Nature Methods, 8(6), 441. (About 8% of men and under 1% of women have a colour vision deficiency, so colour alone must not carry a meaning.)</w:t>
+      </w:r>
+    </w:p>
+    <w:p>
+      <w:pPr>
+        <w:spacing w:before="0" w:after="80"/>
+        <w:ind w:left="283" w:hanging="283"/>
+      </w:pPr>
+      <w:r>
+        <w:rPr>
+          <w:sz w:val="19"/>
+        </w:rPr>
         <w:t>British Dyslexia Association (2023). Dyslexia Style Guide. (Plain language, short sentences, left-aligned text, good spacing and no blocks of italics or capitals help readers with dyslexia.)</w:t>
+      </w:r>
+    </w:p>
+    <w:p>
+      <w:pPr>
+        <w:spacing w:before="0" w:after="80"/>
+        <w:ind w:left="283" w:hanging="283"/>
+      </w:pPr>
+      <w:r>
+        <w:rPr>
+          <w:sz w:val="19"/>
+        </w:rPr>
+        <w:t>World Health Organization. Autism spectrum disorders (fact sheet, 2022 edition). https://www.who.int/news-room/fact-sheets/detail/autism-spectrum-disorders (About one in 100 children has autism, as an average estimate; reported prevalence varies a lot between studies.)</w:t>
+      </w:r>
+    </w:p>
+    <w:p>
+      <w:pPr>
+        <w:spacing w:before="0" w:after="80"/>
+        <w:ind w:left="283" w:hanging="283"/>
+      </w:pPr>
+      <w:r>
+        <w:rPr>
+          <w:sz w:val="19"/>
+        </w:rPr>
+        <w:t>Dyslexia Action. The prevalence of dyslexia. https://dyslexiaaction.org.uk/ (Prevalence depends on the definition and is best described as a continuum; the often-quoted 10% figure has no traceable original source.)</w:t>
       </w:r>
     </w:p>
     <w:p>

</xml_diff>

<commit_message>
Day 12 fix and rule 2.17 closed for all 16 days
Day 12 card A3 now cites a second source (Holmes 2018), so verify:depth passes for all 16 days.
UX-STANDARD 2.17 records that Days 2 to 16 followed. Word documents of Day 12 rebuilt.

Co-Authored-By: Claude Sonnet 5.5 <noreply@anthropic.com>
</commit_message>
<xml_diff>
--- a/docx/Day12-Materi-AION-UX-Developer-Accessibility-standards-and-neurodiversity.docx
+++ b/docx/Day12-Materi-AION-UX-Developer-Accessibility-standards-and-neurodiversity.docx
@@ -4691,9 +4691,9 @@
         </w:tblCellMar>
       </w:tblPr>
       <w:tblGrid>
-        <w:gridCol w:w="1877"/>
-        <w:gridCol w:w="4412"/>
-        <w:gridCol w:w="3349"/>
+        <w:gridCol w:w="1773"/>
+        <w:gridCol w:w="3899"/>
+        <w:gridCol w:w="3966"/>
       </w:tblGrid>
       <w:tr>
         <w:trPr>
@@ -4702,7 +4702,7 @@
         </w:trPr>
         <w:tc>
           <w:tcPr>
-            <w:tcW w:type="dxa" w:w="1877"/>
+            <w:tcW w:type="dxa" w:w="1773"/>
             <w:shd w:val="clear" w:color="auto" w:fill="E6ECF4"/>
           </w:tcPr>
           <w:p>
@@ -4720,7 +4720,7 @@
         </w:tc>
         <w:tc>
           <w:tcPr>
-            <w:tcW w:type="dxa" w:w="4412"/>
+            <w:tcW w:type="dxa" w:w="3899"/>
             <w:shd w:val="clear" w:color="auto" w:fill="E6ECF4"/>
           </w:tcPr>
           <w:p>
@@ -4738,7 +4738,7 @@
         </w:tc>
         <w:tc>
           <w:tcPr>
-            <w:tcW w:type="dxa" w:w="3349"/>
+            <w:tcW w:type="dxa" w:w="3966"/>
             <w:shd w:val="clear" w:color="auto" w:fill="E6ECF4"/>
           </w:tcPr>
           <w:p>
@@ -4761,7 +4761,7 @@
         </w:trPr>
         <w:tc>
           <w:tcPr>
-            <w:tcW w:type="dxa" w:w="1877"/>
+            <w:tcW w:type="dxa" w:w="1773"/>
           </w:tcPr>
           <w:p>
             <w:pPr>
@@ -4777,7 +4777,7 @@
         </w:tc>
         <w:tc>
           <w:tcPr>
-            <w:tcW w:type="dxa" w:w="4412"/>
+            <w:tcW w:type="dxa" w:w="3899"/>
           </w:tcPr>
           <w:p>
             <w:pPr>
@@ -4793,7 +4793,7 @@
         </w:tc>
         <w:tc>
           <w:tcPr>
-            <w:tcW w:type="dxa" w:w="3349"/>
+            <w:tcW w:type="dxa" w:w="3966"/>
           </w:tcPr>
           <w:p>
             <w:pPr>
@@ -4814,7 +4814,7 @@
         </w:trPr>
         <w:tc>
           <w:tcPr>
-            <w:tcW w:type="dxa" w:w="1877"/>
+            <w:tcW w:type="dxa" w:w="1773"/>
           </w:tcPr>
           <w:p>
             <w:pPr>
@@ -4830,7 +4830,7 @@
         </w:tc>
         <w:tc>
           <w:tcPr>
-            <w:tcW w:type="dxa" w:w="4412"/>
+            <w:tcW w:type="dxa" w:w="3899"/>
           </w:tcPr>
           <w:p>
             <w:pPr>
@@ -4846,7 +4846,7 @@
         </w:tc>
         <w:tc>
           <w:tcPr>
-            <w:tcW w:type="dxa" w:w="3349"/>
+            <w:tcW w:type="dxa" w:w="3966"/>
           </w:tcPr>
           <w:p>
             <w:pPr>
@@ -4867,7 +4867,7 @@
         </w:trPr>
         <w:tc>
           <w:tcPr>
-            <w:tcW w:type="dxa" w:w="1877"/>
+            <w:tcW w:type="dxa" w:w="1773"/>
           </w:tcPr>
           <w:p>
             <w:pPr>
@@ -4883,7 +4883,7 @@
         </w:tc>
         <w:tc>
           <w:tcPr>
-            <w:tcW w:type="dxa" w:w="4412"/>
+            <w:tcW w:type="dxa" w:w="3899"/>
           </w:tcPr>
           <w:p>
             <w:pPr>
@@ -4899,7 +4899,7 @@
         </w:tc>
         <w:tc>
           <w:tcPr>
-            <w:tcW w:type="dxa" w:w="3349"/>
+            <w:tcW w:type="dxa" w:w="3966"/>
           </w:tcPr>
           <w:p>
             <w:pPr>
@@ -4920,7 +4920,7 @@
         </w:trPr>
         <w:tc>
           <w:tcPr>
-            <w:tcW w:type="dxa" w:w="1877"/>
+            <w:tcW w:type="dxa" w:w="1773"/>
           </w:tcPr>
           <w:p>
             <w:pPr>
@@ -4936,7 +4936,7 @@
         </w:tc>
         <w:tc>
           <w:tcPr>
-            <w:tcW w:type="dxa" w:w="4412"/>
+            <w:tcW w:type="dxa" w:w="3899"/>
           </w:tcPr>
           <w:p>
             <w:pPr>
@@ -4952,7 +4952,7 @@
         </w:tc>
         <w:tc>
           <w:tcPr>
-            <w:tcW w:type="dxa" w:w="3349"/>
+            <w:tcW w:type="dxa" w:w="3966"/>
           </w:tcPr>
           <w:p>
             <w:pPr>
@@ -4962,7 +4962,7 @@
               <w:rPr>
                 <w:sz w:val="20"/>
               </w:rPr>
-              <w:t>Small, crowded targets are a barrier for tremor and for thumbs.</w:t>
+              <w:t>Small, crowded targets are a barrier for tremor and for thumbs, and for a person with a broken arm or a baby in one arm (Holmes 2018: permanent, temporary and situational limits).</w:t>
             </w:r>
           </w:p>
         </w:tc>
@@ -5211,7 +5211,7 @@
           <w:color w:val="556274"/>
           <w:sz w:val="18"/>
         </w:rPr>
-        <w:t>WCAG 2.2</w:t>
+        <w:t>WCAG 2.2 · Holmes 2018</w:t>
       </w:r>
     </w:p>
     <w:p>

</xml_diff>